<commit_message>
Added check for unknown argument, exits if any exist
	Fixed edge case with embedded format strings (ie:  if nonletters are before the format)
	Added --excludedir cli option and dir= ini file option to exclude a directory from processing
	Added protection to avoid overwriting any existing files
	Added NO_LOCALIZATION to ini file for ignoring, so that a single line can be ignored by adding a comment at the end
	Added check for outdir containing PluginData
	Updated README with correct executable name
</commit_message>
<xml_diff>
--- a/Docs/Instructions.docx
+++ b/Docs/Instructions.docx
@@ -698,39 +698,7 @@
     </w:p>
     <w:p>
       <w:r>
-        <w:t xml:space="preserve">There have been at least two utilities written over the years to address this.  The first, written </w:t>
-      </w:r>
-      <w:proofErr w:type="gramStart"/>
-      <w:r>
-        <w:t>by @</w:t>
-      </w:r>
-      <w:proofErr w:type="gramEnd"/>
-      <w:r>
-        <w:t xml:space="preserve">Dr. jet, is a python script that only localizes part file, science descriptions and </w:t>
-      </w:r>
-      <w:proofErr w:type="spellStart"/>
-      <w:r>
-        <w:t>ModuleManager</w:t>
-      </w:r>
-      <w:proofErr w:type="spellEnd"/>
-      <w:r>
-        <w:t xml:space="preserve"> patches.  The second, written by @IgnorZ, is more </w:t>
-      </w:r>
-      <w:proofErr w:type="gramStart"/>
-      <w:r>
-        <w:t>ambitious,  in</w:t>
-      </w:r>
-      <w:proofErr w:type="gramEnd"/>
-      <w:r>
-        <w:t xml:space="preserve"> that it works as a mod, and does more, reading the game database to extract strings.  However, it also does not touch any </w:t>
-      </w:r>
-      <w:proofErr w:type="spellStart"/>
-      <w:r>
-        <w:t>CSharp</w:t>
-      </w:r>
-      <w:proofErr w:type="spellEnd"/>
-      <w:r>
-        <w:t xml:space="preserve"> code in any of the mods.</w:t>
+        <w:t>There have been at least two utilities written over the years to address this.  The first, written by @Dr. jet, is a python script that only localizes part file, science descriptions and ModuleManager patches.  The second, written by @IgnorZ, is more ambitious,  in that it works as a mod, and does more, reading the game database to extract strings.  However, it also does not touch any CSharp code in any of the mods.</w:t>
       </w:r>
     </w:p>
     <w:p>
@@ -772,15 +740,7 @@
         <w:t xml:space="preserve">This </w:t>
       </w:r>
       <w:r>
-        <w:t>tool scans `.cs` and `.</w:t>
-      </w:r>
-      <w:proofErr w:type="spellStart"/>
-      <w:r>
-        <w:t>cfg</w:t>
-      </w:r>
-      <w:proofErr w:type="spellEnd"/>
-      <w:r>
-        <w:t>` files for localizable strings and generates:</w:t>
+        <w:t>tool scans `.cs` and `.cfg` files for localizable strings and generates:</w:t>
       </w:r>
     </w:p>
     <w:p>
@@ -792,15 +752,7 @@
         </w:numPr>
       </w:pPr>
       <w:r>
-        <w:t>`Localization/</w:t>
-      </w:r>
-      <w:proofErr w:type="spellStart"/>
-      <w:r>
-        <w:t>en-us.cfg</w:t>
-      </w:r>
-      <w:proofErr w:type="spellEnd"/>
-      <w:r>
-        <w:t>` – for use in KSP</w:t>
+        <w:t>`Localization/en-us.cfg` – for use in KSP</w:t>
       </w:r>
     </w:p>
     <w:p>
@@ -839,15 +791,7 @@
         <w:t>The o</w:t>
       </w:r>
       <w:r>
-        <w:t>riginal files are backed up to &lt;file&gt;.</w:t>
-      </w:r>
-      <w:proofErr w:type="spellStart"/>
-      <w:r>
-        <w:t>bak</w:t>
-      </w:r>
-      <w:proofErr w:type="spellEnd"/>
-      <w:r>
-        <w:t xml:space="preserve"> file for easy reverts</w:t>
+        <w:t>riginal files are backed up to &lt;file&gt;.bak file for easy reverts</w:t>
       </w:r>
     </w:p>
     <w:p>
@@ -872,31 +816,10 @@
       </w:pPr>
       <w:r>
         <w:lastRenderedPageBreak/>
-        <w:t xml:space="preserve">This is run as a command line script.  It’s written </w:t>
-      </w:r>
-      <w:proofErr w:type="gramStart"/>
-      <w:r>
-        <w:t>in</w:t>
-      </w:r>
-      <w:proofErr w:type="gramEnd"/>
-      <w:r>
-        <w:t xml:space="preserve"> </w:t>
-      </w:r>
-      <w:proofErr w:type="spellStart"/>
-      <w:proofErr w:type="gramStart"/>
-      <w:r>
-        <w:t>CSharp</w:t>
-      </w:r>
-      <w:proofErr w:type="spellEnd"/>
-      <w:r>
-        <w:t xml:space="preserve">,  </w:t>
-      </w:r>
-      <w:r>
-        <w:t>as</w:t>
-      </w:r>
-      <w:proofErr w:type="gramEnd"/>
-      <w:r>
-        <w:t xml:space="preserve"> a .NET 8 program.</w:t>
+        <w:t xml:space="preserve">This is run as a command line script.  It’s written in CSharp,  </w:t>
+      </w:r>
+      <w:r>
+        <w:t>as a .NET 8 program.</w:t>
       </w:r>
     </w:p>
     <w:p>
@@ -929,13 +852,8 @@
         <w:t xml:space="preserve">the </w:t>
       </w:r>
       <w:r>
-        <w:t xml:space="preserve">release zip file and unpack it somewhere.  The zip file will contain a folder called </w:t>
-      </w:r>
-      <w:proofErr w:type="spellStart"/>
-      <w:r>
-        <w:t>KSPLocalizer</w:t>
-      </w:r>
-      <w:proofErr w:type="spellEnd"/>
+        <w:t>release zip file and unpack it somewhere.  The zip file will contain a folder called KSPLocalizer</w:t>
+      </w:r>
       <w:r>
         <w:t>.</w:t>
       </w:r>
@@ -1036,7 +954,6 @@
         <w:tab/>
         <w:t xml:space="preserve">The zip file will contain a folder called </w:t>
       </w:r>
-      <w:proofErr w:type="spellStart"/>
       <w:r>
         <w:rPr>
           <w:b/>
@@ -1044,7 +961,6 @@
         </w:rPr>
         <w:t>KSPLocalizer</w:t>
       </w:r>
-      <w:proofErr w:type="spellEnd"/>
       <w:r>
         <w:t xml:space="preserve">. </w:t>
       </w:r>
@@ -1095,9 +1011,6 @@
       </w:r>
       <w:r>
         <w:tab/>
-      </w:r>
-      <w:proofErr w:type="gramStart"/>
-      <w:r>
         <w:t>localizer.cmd</w:t>
       </w:r>
       <w:r>
@@ -1107,25 +1020,18 @@
         <w:tab/>
       </w:r>
       <w:r>
-        <w:t>(</w:t>
-      </w:r>
-      <w:proofErr w:type="gramEnd"/>
-      <w:r>
-        <w:t>for use on Windows)</w:t>
-      </w:r>
-    </w:p>
-    <w:p>
-      <w:pPr>
-        <w:spacing w:after="0"/>
-      </w:pPr>
-      <w:r>
-        <w:tab/>
-      </w:r>
-      <w:r>
-        <w:tab/>
-      </w:r>
-      <w:proofErr w:type="gramStart"/>
-      <w:r>
+        <w:t>(for use on Windows)</w:t>
+      </w:r>
+    </w:p>
+    <w:p>
+      <w:pPr>
+        <w:spacing w:after="0"/>
+      </w:pPr>
+      <w:r>
+        <w:tab/>
+      </w:r>
+      <w:r>
+        <w:tab/>
         <w:t>localizer.sh</w:t>
       </w:r>
       <w:r>
@@ -1135,11 +1041,7 @@
         <w:tab/>
       </w:r>
       <w:r>
-        <w:t>(</w:t>
-      </w:r>
-      <w:proofErr w:type="gramEnd"/>
-      <w:r>
-        <w:t>for use on Mac or Linux)</w:t>
+        <w:t>(for use on Mac or Linux)</w:t>
       </w:r>
     </w:p>
     <w:p>
@@ -1210,113 +1112,71 @@
           <w:rFonts w:ascii="Courier New" w:hAnsi="Courier New" w:cs="Courier New"/>
         </w:rPr>
         <w:tab/>
-        <w:t xml:space="preserve">cd </w:t>
-      </w:r>
-      <w:proofErr w:type="spellStart"/>
-      <w:r>
-        <w:rPr>
-          <w:rFonts w:ascii="Courier New" w:hAnsi="Courier New" w:cs="Courier New"/>
-        </w:rPr>
-        <w:t>KSPLocalizer</w:t>
-      </w:r>
-      <w:proofErr w:type="spellEnd"/>
-    </w:p>
-    <w:p>
-      <w:pPr>
-        <w:spacing w:after="0"/>
-        <w:rPr>
-          <w:rFonts w:ascii="Courier New" w:hAnsi="Courier New" w:cs="Courier New"/>
-        </w:rPr>
-      </w:pPr>
-      <w:r>
-        <w:rPr>
-          <w:rFonts w:ascii="Courier New" w:hAnsi="Courier New" w:cs="Courier New"/>
-        </w:rPr>
-        <w:tab/>
-      </w:r>
-      <w:r>
-        <w:rPr>
-          <w:rFonts w:ascii="Courier New" w:hAnsi="Courier New" w:cs="Courier New"/>
-        </w:rPr>
-        <w:tab/>
-      </w:r>
-      <w:proofErr w:type="spellStart"/>
-      <w:r>
-        <w:rPr>
-          <w:rFonts w:ascii="Courier New" w:hAnsi="Courier New" w:cs="Courier New"/>
-        </w:rPr>
-        <w:t>chmod</w:t>
-      </w:r>
-      <w:proofErr w:type="spellEnd"/>
-      <w:r>
-        <w:rPr>
-          <w:rFonts w:ascii="Courier New" w:hAnsi="Courier New" w:cs="Courier New"/>
-        </w:rPr>
-        <w:t xml:space="preserve"> -x *</w:t>
-      </w:r>
-    </w:p>
-    <w:p>
-      <w:pPr>
-        <w:spacing w:after="0"/>
-        <w:rPr>
-          <w:rFonts w:ascii="Courier New" w:hAnsi="Courier New" w:cs="Courier New"/>
-        </w:rPr>
-      </w:pPr>
-      <w:r>
-        <w:rPr>
-          <w:rFonts w:ascii="Courier New" w:hAnsi="Courier New" w:cs="Courier New"/>
-        </w:rPr>
-        <w:tab/>
-      </w:r>
-      <w:r>
-        <w:rPr>
-          <w:rFonts w:ascii="Courier New" w:hAnsi="Courier New" w:cs="Courier New"/>
-        </w:rPr>
-        <w:tab/>
-      </w:r>
-      <w:proofErr w:type="spellStart"/>
-      <w:r>
-        <w:rPr>
-          <w:rFonts w:ascii="Courier New" w:hAnsi="Courier New" w:cs="Courier New"/>
-        </w:rPr>
-        <w:t>chmod</w:t>
-      </w:r>
-      <w:proofErr w:type="spellEnd"/>
-      <w:r>
-        <w:rPr>
-          <w:rFonts w:ascii="Courier New" w:hAnsi="Courier New" w:cs="Courier New"/>
-        </w:rPr>
-        <w:t xml:space="preserve"> 755 localizer.sh</w:t>
-      </w:r>
-    </w:p>
-    <w:p>
-      <w:pPr>
-        <w:spacing w:after="0"/>
-        <w:rPr>
-          <w:rFonts w:ascii="Courier New" w:hAnsi="Courier New" w:cs="Courier New"/>
-        </w:rPr>
-      </w:pPr>
-      <w:r>
-        <w:rPr>
-          <w:rFonts w:ascii="Courier New" w:hAnsi="Courier New" w:cs="Courier New"/>
-        </w:rPr>
-        <w:tab/>
-      </w:r>
-      <w:r>
-        <w:rPr>
-          <w:rFonts w:ascii="Courier New" w:hAnsi="Courier New" w:cs="Courier New"/>
-        </w:rPr>
-        <w:tab/>
-        <w:t>dos2</w:t>
-      </w:r>
-      <w:proofErr w:type="gramStart"/>
-      <w:r>
-        <w:rPr>
-          <w:rFonts w:ascii="Courier New" w:hAnsi="Courier New" w:cs="Courier New"/>
-        </w:rPr>
-        <w:t>unix  localizer.sh</w:t>
-      </w:r>
-      <w:proofErr w:type="gramEnd"/>
+        <w:t>cd KSPLocalizer</w:t>
+      </w:r>
+    </w:p>
+    <w:p>
+      <w:pPr>
+        <w:spacing w:after="0"/>
+        <w:rPr>
+          <w:rFonts w:ascii="Courier New" w:hAnsi="Courier New" w:cs="Courier New"/>
+        </w:rPr>
+      </w:pPr>
+      <w:r>
+        <w:rPr>
+          <w:rFonts w:ascii="Courier New" w:hAnsi="Courier New" w:cs="Courier New"/>
+        </w:rPr>
+        <w:tab/>
+      </w:r>
+      <w:r>
+        <w:rPr>
+          <w:rFonts w:ascii="Courier New" w:hAnsi="Courier New" w:cs="Courier New"/>
+        </w:rPr>
+        <w:tab/>
+        <w:t>chmod -x *</w:t>
+      </w:r>
+    </w:p>
+    <w:p>
+      <w:pPr>
+        <w:spacing w:after="0"/>
+        <w:rPr>
+          <w:rFonts w:ascii="Courier New" w:hAnsi="Courier New" w:cs="Courier New"/>
+        </w:rPr>
+      </w:pPr>
+      <w:r>
+        <w:rPr>
+          <w:rFonts w:ascii="Courier New" w:hAnsi="Courier New" w:cs="Courier New"/>
+        </w:rPr>
+        <w:tab/>
+      </w:r>
+      <w:r>
+        <w:rPr>
+          <w:rFonts w:ascii="Courier New" w:hAnsi="Courier New" w:cs="Courier New"/>
+        </w:rPr>
+        <w:tab/>
+        <w:t>chmod 755 localizer.sh</w:t>
+      </w:r>
+    </w:p>
+    <w:p>
+      <w:pPr>
+        <w:spacing w:after="0"/>
+        <w:rPr>
+          <w:rFonts w:ascii="Courier New" w:hAnsi="Courier New" w:cs="Courier New"/>
+        </w:rPr>
+      </w:pPr>
+      <w:r>
+        <w:rPr>
+          <w:rFonts w:ascii="Courier New" w:hAnsi="Courier New" w:cs="Courier New"/>
+        </w:rPr>
+        <w:tab/>
+      </w:r>
+      <w:r>
+        <w:rPr>
+          <w:rFonts w:ascii="Courier New" w:hAnsi="Courier New" w:cs="Courier New"/>
+        </w:rPr>
+        <w:tab/>
+        <w:t>dos2unix  localizer.sh</w:t>
+      </w:r>
     </w:p>
     <w:p>
       <w:pPr>
@@ -1363,31 +1223,15 @@
         <w:t>0</w:t>
       </w:r>
       <w:r>
-        <w:t xml:space="preserve"> program an additional </w:t>
-      </w:r>
-      <w:proofErr w:type="spellStart"/>
-      <w:r>
-        <w:t>linux</w:t>
-      </w:r>
-      <w:proofErr w:type="spellEnd"/>
-      <w:r>
-        <w:t xml:space="preserve"> package is needed in order </w:t>
-      </w:r>
-    </w:p>
-    <w:p>
-      <w:pPr>
-        <w:spacing w:after="0"/>
-      </w:pPr>
-      <w:r>
-        <w:t xml:space="preserve">to run this on Linux.  How to </w:t>
-      </w:r>
-      <w:proofErr w:type="gramStart"/>
-      <w:r>
-        <w:t>install</w:t>
-      </w:r>
-      <w:proofErr w:type="gramEnd"/>
-      <w:r>
-        <w:t xml:space="preserve"> will depend on the version of Linux</w:t>
+        <w:t xml:space="preserve"> program an additional linux package is needed in order </w:t>
+      </w:r>
+    </w:p>
+    <w:p>
+      <w:pPr>
+        <w:spacing w:after="0"/>
+      </w:pPr>
+      <w:r>
+        <w:t>to run this on Linux.  How to install will depend on the version of Linux</w:t>
       </w:r>
     </w:p>
     <w:p>
@@ -1457,41 +1301,13 @@
       <w:r>
         <w:tab/>
       </w:r>
-      <w:proofErr w:type="spellStart"/>
-      <w:r>
-        <w:rPr>
-          <w:rFonts w:ascii="Courier New" w:hAnsi="Courier New" w:cs="Courier New"/>
-          <w:sz w:val="18"/>
-          <w:szCs w:val="18"/>
-        </w:rPr>
-        <w:t>sudo</w:t>
-      </w:r>
-      <w:proofErr w:type="spellEnd"/>
-      <w:r>
-        <w:rPr>
-          <w:rFonts w:ascii="Courier New" w:hAnsi="Courier New" w:cs="Courier New"/>
-          <w:sz w:val="18"/>
-          <w:szCs w:val="18"/>
-        </w:rPr>
-        <w:t xml:space="preserve"> apt-get update &amp;&amp; </w:t>
-      </w:r>
-      <w:proofErr w:type="spellStart"/>
-      <w:r>
-        <w:rPr>
-          <w:rFonts w:ascii="Courier New" w:hAnsi="Courier New" w:cs="Courier New"/>
-          <w:sz w:val="18"/>
-          <w:szCs w:val="18"/>
-        </w:rPr>
-        <w:t>sudo</w:t>
-      </w:r>
-      <w:proofErr w:type="spellEnd"/>
-      <w:r>
-        <w:rPr>
-          <w:rFonts w:ascii="Courier New" w:hAnsi="Courier New" w:cs="Courier New"/>
-          <w:sz w:val="18"/>
-          <w:szCs w:val="18"/>
-        </w:rPr>
-        <w:t xml:space="preserve"> apt-get install -y dotnet-sdk-8.0</w:t>
+      <w:r>
+        <w:rPr>
+          <w:rFonts w:ascii="Courier New" w:hAnsi="Courier New" w:cs="Courier New"/>
+          <w:sz w:val="18"/>
+          <w:szCs w:val="18"/>
+        </w:rPr>
+        <w:t>sudo apt-get update &amp;&amp; sudo apt-get install -y dotnet-sdk-8.0</w:t>
       </w:r>
     </w:p>
     <w:p>
@@ -1509,1299 +1325,607 @@
       <w:r>
         <w:tab/>
       </w:r>
-      <w:proofErr w:type="spellStart"/>
-      <w:r>
-        <w:rPr>
-          <w:rFonts w:ascii="Courier New" w:hAnsi="Courier New" w:cs="Courier New"/>
-          <w:sz w:val="18"/>
-          <w:szCs w:val="18"/>
-        </w:rPr>
-        <w:t>sudo</w:t>
-      </w:r>
-      <w:proofErr w:type="spellEnd"/>
-      <w:r>
-        <w:rPr>
-          <w:rFonts w:ascii="Courier New" w:hAnsi="Courier New" w:cs="Courier New"/>
-          <w:sz w:val="18"/>
-          <w:szCs w:val="18"/>
-        </w:rPr>
+      <w:r>
+        <w:rPr>
+          <w:rFonts w:ascii="Courier New" w:hAnsi="Courier New" w:cs="Courier New"/>
+          <w:sz w:val="18"/>
+          <w:szCs w:val="18"/>
+        </w:rPr>
+        <w:t>sudo apk add dotnet8-sdk</w:t>
+      </w:r>
+    </w:p>
+    <w:p>
+      <w:pPr>
+        <w:spacing w:after="0"/>
+      </w:pPr>
+      <w:r>
+        <w:t>CentOS Stream 8, 9</w:t>
+      </w:r>
+      <w:r>
+        <w:tab/>
+      </w:r>
+      <w:r>
+        <w:rPr>
+          <w:rFonts w:ascii="Courier New" w:hAnsi="Courier New" w:cs="Courier New"/>
+          <w:sz w:val="18"/>
+          <w:szCs w:val="18"/>
+        </w:rPr>
+        <w:t>sudo dnf install dotnet-runtime-8.0</w:t>
+      </w:r>
+    </w:p>
+    <w:p>
+      <w:pPr>
+        <w:spacing w:after="0"/>
+        <w:rPr>
+          <w:rFonts w:ascii="Courier New" w:hAnsi="Courier New" w:cs="Courier New"/>
+          <w:sz w:val="18"/>
+          <w:szCs w:val="18"/>
+        </w:rPr>
+      </w:pPr>
+      <w:r>
+        <w:t>RHEL 8, 9</w:t>
+      </w:r>
+      <w:r>
+        <w:tab/>
+      </w:r>
+      <w:r>
+        <w:tab/>
+      </w:r>
+      <w:r>
+        <w:rPr>
+          <w:rFonts w:ascii="Courier New" w:hAnsi="Courier New" w:cs="Courier New"/>
+          <w:sz w:val="18"/>
+          <w:szCs w:val="18"/>
+        </w:rPr>
+        <w:t>sudo dnf install dotnet-runtime-8.0</w:t>
+      </w:r>
+    </w:p>
+    <w:p>
+      <w:pPr>
+        <w:spacing w:after="0"/>
+      </w:pPr>
+    </w:p>
+    <w:p>
+      <w:pPr>
+        <w:spacing w:after="0"/>
+        <w:rPr>
+          <w:rFonts w:ascii="Courier New" w:hAnsi="Courier New" w:cs="Courier New"/>
+          <w:sz w:val="18"/>
+          <w:szCs w:val="18"/>
+        </w:rPr>
+      </w:pPr>
+      <w:r>
+        <w:t>Debian 12</w:t>
+      </w:r>
+      <w:r>
+        <w:tab/>
+      </w:r>
+      <w:r>
+        <w:tab/>
+      </w:r>
+      <w:r>
+        <w:rPr>
+          <w:rFonts w:ascii="Courier New" w:hAnsi="Courier New" w:cs="Courier New"/>
+          <w:sz w:val="18"/>
+          <w:szCs w:val="18"/>
+        </w:rPr>
+        <w:t>wget https://packages.microsoft.com/config/debian/12/packages-microsoft-prod.deb -O packages-microsoft-prod.deb</w:t>
+      </w:r>
+    </w:p>
+    <w:p>
+      <w:pPr>
+        <w:spacing w:after="0"/>
+        <w:rPr>
+          <w:rFonts w:ascii="Courier New" w:hAnsi="Courier New" w:cs="Courier New"/>
+          <w:sz w:val="18"/>
+          <w:szCs w:val="18"/>
+        </w:rPr>
+      </w:pPr>
+      <w:r>
+        <w:rPr>
+          <w:rFonts w:ascii="Courier New" w:hAnsi="Courier New" w:cs="Courier New"/>
+          <w:sz w:val="18"/>
+          <w:szCs w:val="18"/>
+        </w:rPr>
+        <w:tab/>
+      </w:r>
+      <w:r>
+        <w:rPr>
+          <w:rFonts w:ascii="Courier New" w:hAnsi="Courier New" w:cs="Courier New"/>
+          <w:sz w:val="18"/>
+          <w:szCs w:val="18"/>
+        </w:rPr>
+        <w:tab/>
+      </w:r>
+      <w:r>
+        <w:rPr>
+          <w:rFonts w:ascii="Courier New" w:hAnsi="Courier New" w:cs="Courier New"/>
+          <w:sz w:val="18"/>
+          <w:szCs w:val="18"/>
+        </w:rPr>
+        <w:tab/>
+        <w:t>sudo dpkg -i packages-microsoft-prod.deb</w:t>
+      </w:r>
+    </w:p>
+    <w:p>
+      <w:pPr>
+        <w:spacing w:after="0"/>
+        <w:rPr>
+          <w:rFonts w:ascii="Courier New" w:hAnsi="Courier New" w:cs="Courier New"/>
+          <w:sz w:val="18"/>
+          <w:szCs w:val="18"/>
+        </w:rPr>
+      </w:pPr>
+      <w:r>
+        <w:rPr>
+          <w:rFonts w:ascii="Courier New" w:hAnsi="Courier New" w:cs="Courier New"/>
+          <w:sz w:val="18"/>
+          <w:szCs w:val="18"/>
+        </w:rPr>
+        <w:tab/>
+      </w:r>
+      <w:r>
+        <w:rPr>
+          <w:rFonts w:ascii="Courier New" w:hAnsi="Courier New" w:cs="Courier New"/>
+          <w:sz w:val="18"/>
+          <w:szCs w:val="18"/>
+        </w:rPr>
+        <w:tab/>
+      </w:r>
+      <w:r>
+        <w:rPr>
+          <w:rFonts w:ascii="Courier New" w:hAnsi="Courier New" w:cs="Courier New"/>
+          <w:sz w:val="18"/>
+          <w:szCs w:val="18"/>
+        </w:rPr>
+        <w:tab/>
+        <w:t>rm packages-microsoft-prod.deb</w:t>
+      </w:r>
+    </w:p>
+    <w:p>
+      <w:pPr>
+        <w:spacing w:after="0"/>
+        <w:rPr>
+          <w:rFonts w:ascii="Courier New" w:hAnsi="Courier New" w:cs="Courier New"/>
+          <w:sz w:val="18"/>
+          <w:szCs w:val="18"/>
+        </w:rPr>
+      </w:pPr>
+      <w:r>
+        <w:rPr>
+          <w:rFonts w:ascii="Courier New" w:hAnsi="Courier New" w:cs="Courier New"/>
+          <w:sz w:val="18"/>
+          <w:szCs w:val="18"/>
+        </w:rPr>
+        <w:tab/>
+      </w:r>
+      <w:r>
+        <w:rPr>
+          <w:rFonts w:ascii="Courier New" w:hAnsi="Courier New" w:cs="Courier New"/>
+          <w:sz w:val="18"/>
+          <w:szCs w:val="18"/>
+        </w:rPr>
+        <w:tab/>
+      </w:r>
+      <w:r>
+        <w:rPr>
+          <w:rFonts w:ascii="Courier New" w:hAnsi="Courier New" w:cs="Courier New"/>
+          <w:sz w:val="18"/>
+          <w:szCs w:val="18"/>
+        </w:rPr>
+        <w:tab/>
+        <w:t>sudo apt-get update &amp;&amp; sudo apt-get install -y dotnet-sdk-8.0</w:t>
+      </w:r>
+    </w:p>
+    <w:p>
+      <w:pPr>
+        <w:spacing w:after="0"/>
+      </w:pPr>
+      <w:r>
+        <w:tab/>
+      </w:r>
+    </w:p>
+    <w:p>
+      <w:pPr>
+        <w:spacing w:after="0"/>
+        <w:rPr>
+          <w:rFonts w:ascii="Courier New" w:hAnsi="Courier New" w:cs="Courier New"/>
+          <w:sz w:val="18"/>
+          <w:szCs w:val="18"/>
+        </w:rPr>
+      </w:pPr>
+      <w:r>
+        <w:t>Fedora 40, 41</w:t>
+      </w:r>
+      <w:r>
+        <w:tab/>
+      </w:r>
+      <w:r>
+        <w:tab/>
+      </w:r>
+      <w:r>
+        <w:rPr>
+          <w:rFonts w:ascii="Courier New" w:hAnsi="Courier New" w:cs="Courier New"/>
+          <w:sz w:val="18"/>
+          <w:szCs w:val="18"/>
+        </w:rPr>
+        <w:t>sudo dnf install dotnet-runtime-8.0</w:t>
+      </w:r>
+    </w:p>
+    <w:p>
+      <w:pPr>
+        <w:spacing w:after="0"/>
+      </w:pPr>
+    </w:p>
+    <w:p>
+      <w:pPr>
+        <w:spacing w:after="0"/>
+        <w:rPr>
+          <w:rFonts w:ascii="Courier New" w:hAnsi="Courier New" w:cs="Courier New"/>
+          <w:sz w:val="18"/>
+          <w:szCs w:val="18"/>
+        </w:rPr>
+      </w:pPr>
+      <w:r>
+        <w:t>openSUSE Leap 15</w:t>
+      </w:r>
+      <w:r>
+        <w:tab/>
+      </w:r>
+      <w:r>
+        <w:rPr>
+          <w:rFonts w:ascii="Courier New" w:hAnsi="Courier New" w:cs="Courier New"/>
+          <w:sz w:val="18"/>
+          <w:szCs w:val="18"/>
+        </w:rPr>
+        <w:t>sudo zypper install libicu</w:t>
+      </w:r>
+    </w:p>
+    <w:p>
+      <w:pPr>
+        <w:spacing w:after="0"/>
+        <w:rPr>
+          <w:rFonts w:ascii="Courier New" w:hAnsi="Courier New" w:cs="Courier New"/>
+          <w:sz w:val="18"/>
+          <w:szCs w:val="18"/>
+        </w:rPr>
+      </w:pPr>
+      <w:r>
+        <w:rPr>
+          <w:rFonts w:ascii="Courier New" w:hAnsi="Courier New" w:cs="Courier New"/>
+          <w:sz w:val="18"/>
+          <w:szCs w:val="18"/>
+        </w:rPr>
+        <w:tab/>
+      </w:r>
+      <w:r>
+        <w:rPr>
+          <w:rFonts w:ascii="Courier New" w:hAnsi="Courier New" w:cs="Courier New"/>
+          <w:sz w:val="18"/>
+          <w:szCs w:val="18"/>
+        </w:rPr>
+        <w:tab/>
+      </w:r>
+      <w:r>
+        <w:rPr>
+          <w:rFonts w:ascii="Courier New" w:hAnsi="Courier New" w:cs="Courier New"/>
+          <w:sz w:val="18"/>
+          <w:szCs w:val="18"/>
+        </w:rPr>
+        <w:tab/>
+        <w:t>sudo rpm --import https://packages.microsoft.com/keys/microsoft.asc</w:t>
+      </w:r>
+    </w:p>
+    <w:p>
+      <w:pPr>
+        <w:spacing w:after="0"/>
+        <w:rPr>
+          <w:rFonts w:ascii="Courier New" w:hAnsi="Courier New" w:cs="Courier New"/>
+          <w:sz w:val="18"/>
+          <w:szCs w:val="18"/>
+        </w:rPr>
+      </w:pPr>
+      <w:r>
+        <w:rPr>
+          <w:rFonts w:ascii="Courier New" w:hAnsi="Courier New" w:cs="Courier New"/>
+          <w:sz w:val="18"/>
+          <w:szCs w:val="18"/>
+        </w:rPr>
+        <w:tab/>
+      </w:r>
+      <w:r>
+        <w:rPr>
+          <w:rFonts w:ascii="Courier New" w:hAnsi="Courier New" w:cs="Courier New"/>
+          <w:sz w:val="18"/>
+          <w:szCs w:val="18"/>
+        </w:rPr>
+        <w:tab/>
+      </w:r>
+      <w:r>
+        <w:rPr>
+          <w:rFonts w:ascii="Courier New" w:hAnsi="Courier New" w:cs="Courier New"/>
+          <w:sz w:val="18"/>
+          <w:szCs w:val="18"/>
+        </w:rPr>
+        <w:tab/>
+        <w:t>wget https://packages.microsoft.com/config/opensuse/15/prod.repo</w:t>
+      </w:r>
+    </w:p>
+    <w:p>
+      <w:pPr>
+        <w:spacing w:after="0"/>
+        <w:rPr>
+          <w:rFonts w:ascii="Courier New" w:hAnsi="Courier New" w:cs="Courier New"/>
+          <w:sz w:val="18"/>
+          <w:szCs w:val="18"/>
+        </w:rPr>
+      </w:pPr>
+      <w:r>
+        <w:rPr>
+          <w:rFonts w:ascii="Courier New" w:hAnsi="Courier New" w:cs="Courier New"/>
+          <w:sz w:val="18"/>
+          <w:szCs w:val="18"/>
+        </w:rPr>
+        <w:tab/>
+      </w:r>
+      <w:r>
+        <w:rPr>
+          <w:rFonts w:ascii="Courier New" w:hAnsi="Courier New" w:cs="Courier New"/>
+          <w:sz w:val="18"/>
+          <w:szCs w:val="18"/>
+        </w:rPr>
+        <w:tab/>
+      </w:r>
+      <w:r>
+        <w:rPr>
+          <w:rFonts w:ascii="Courier New" w:hAnsi="Courier New" w:cs="Courier New"/>
+          <w:sz w:val="18"/>
+          <w:szCs w:val="18"/>
+        </w:rPr>
+        <w:tab/>
+        <w:t>sudo mv prod.repo /etc/zypp/repos.d/microsoft-prod.repo</w:t>
+      </w:r>
+    </w:p>
+    <w:p>
+      <w:pPr>
+        <w:spacing w:after="0"/>
+        <w:rPr>
+          <w:rFonts w:ascii="Courier New" w:hAnsi="Courier New" w:cs="Courier New"/>
+          <w:sz w:val="18"/>
+          <w:szCs w:val="18"/>
+        </w:rPr>
+      </w:pPr>
+      <w:r>
+        <w:rPr>
+          <w:rFonts w:ascii="Courier New" w:hAnsi="Courier New" w:cs="Courier New"/>
+          <w:sz w:val="18"/>
+          <w:szCs w:val="18"/>
+        </w:rPr>
+        <w:tab/>
+      </w:r>
+      <w:r>
+        <w:rPr>
+          <w:rFonts w:ascii="Courier New" w:hAnsi="Courier New" w:cs="Courier New"/>
+          <w:sz w:val="18"/>
+          <w:szCs w:val="18"/>
+        </w:rPr>
+        <w:tab/>
+      </w:r>
+      <w:r>
+        <w:rPr>
+          <w:rFonts w:ascii="Courier New" w:hAnsi="Courier New" w:cs="Courier New"/>
+          <w:sz w:val="18"/>
+          <w:szCs w:val="18"/>
+        </w:rPr>
+        <w:tab/>
+        <w:t>sudo chown root:root /etc/zypp/repos.d/microsoft-prod.repo</w:t>
+      </w:r>
+    </w:p>
+    <w:p>
+      <w:pPr>
+        <w:spacing w:after="0"/>
+        <w:rPr>
+          <w:rFonts w:ascii="Courier New" w:hAnsi="Courier New" w:cs="Courier New"/>
+          <w:sz w:val="18"/>
+          <w:szCs w:val="18"/>
+        </w:rPr>
+      </w:pPr>
+      <w:r>
+        <w:rPr>
+          <w:rFonts w:ascii="Courier New" w:hAnsi="Courier New" w:cs="Courier New"/>
+          <w:sz w:val="18"/>
+          <w:szCs w:val="18"/>
+        </w:rPr>
+        <w:tab/>
+      </w:r>
+      <w:r>
+        <w:rPr>
+          <w:rFonts w:ascii="Courier New" w:hAnsi="Courier New" w:cs="Courier New"/>
+          <w:sz w:val="18"/>
+          <w:szCs w:val="18"/>
+        </w:rPr>
+        <w:tab/>
+      </w:r>
+      <w:r>
+        <w:rPr>
+          <w:rFonts w:ascii="Courier New" w:hAnsi="Courier New" w:cs="Courier New"/>
+          <w:sz w:val="18"/>
+          <w:szCs w:val="18"/>
+        </w:rPr>
+        <w:tab/>
+        <w:t>sudo zypper install dotnet-sdk-8.0</w:t>
+      </w:r>
+    </w:p>
+    <w:p>
+      <w:pPr>
+        <w:spacing w:after="0"/>
+      </w:pPr>
+    </w:p>
+    <w:p>
+      <w:pPr>
+        <w:spacing w:after="0"/>
+        <w:rPr>
+          <w:rFonts w:ascii="Courier New" w:hAnsi="Courier New" w:cs="Courier New"/>
+          <w:sz w:val="18"/>
+          <w:szCs w:val="18"/>
+        </w:rPr>
+      </w:pPr>
+      <w:r>
+        <w:t>SLES 15</w:t>
+      </w:r>
+      <w:r>
+        <w:tab/>
+      </w:r>
+      <w:r>
+        <w:tab/>
+      </w:r>
+      <w:r>
+        <w:rPr>
+          <w:rFonts w:ascii="Courier New" w:hAnsi="Courier New" w:cs="Courier New"/>
+          <w:sz w:val="18"/>
+          <w:szCs w:val="18"/>
+        </w:rPr>
+        <w:t>sudo rpm -Uvh https://packages.microsoft.com/config/sles/15/packages-microsoft-prod.rpm</w:t>
+      </w:r>
+    </w:p>
+    <w:p>
+      <w:pPr>
+        <w:spacing w:after="0"/>
+        <w:rPr>
+          <w:rFonts w:ascii="Courier New" w:hAnsi="Courier New" w:cs="Courier New"/>
+          <w:sz w:val="18"/>
+          <w:szCs w:val="18"/>
+        </w:rPr>
+      </w:pPr>
+      <w:r>
+        <w:rPr>
+          <w:rFonts w:ascii="Courier New" w:hAnsi="Courier New" w:cs="Courier New"/>
+          <w:sz w:val="18"/>
+          <w:szCs w:val="18"/>
+        </w:rPr>
+        <w:tab/>
+      </w:r>
+      <w:r>
+        <w:rPr>
+          <w:rFonts w:ascii="Courier New" w:hAnsi="Courier New" w:cs="Courier New"/>
+          <w:sz w:val="18"/>
+          <w:szCs w:val="18"/>
+        </w:rPr>
+        <w:tab/>
+      </w:r>
+      <w:r>
+        <w:rPr>
+          <w:rFonts w:ascii="Courier New" w:hAnsi="Courier New" w:cs="Courier New"/>
+          <w:sz w:val="18"/>
+          <w:szCs w:val="18"/>
+        </w:rPr>
+        <w:tab/>
+        <w:t>sudo zypper install dotnet-runtime-8.0</w:t>
+      </w:r>
+    </w:p>
+    <w:p>
+      <w:pPr>
+        <w:spacing w:after="0"/>
+      </w:pPr>
+    </w:p>
+    <w:p>
+      <w:pPr>
+        <w:pStyle w:val="Heading3"/>
+      </w:pPr>
+      <w:bookmarkStart w:id="4" w:name="_Toc200005795"/>
+      <w:r>
+        <w:t>SPECIAL INSTRUCTIONS FOR MAC OS</w:t>
+      </w:r>
+      <w:bookmarkEnd w:id="4"/>
+    </w:p>
+    <w:p>
+      <w:pPr>
+        <w:spacing w:after="0"/>
+      </w:pPr>
+    </w:p>
+    <w:p>
+      <w:pPr>
+        <w:spacing w:after="0"/>
+      </w:pPr>
+      <w:r>
+        <w:t>The following versions of macOS are supported by Microsoft for .NET 8.0</w:t>
+      </w:r>
+    </w:p>
+    <w:p>
+      <w:pPr>
+        <w:spacing w:after="0"/>
+      </w:pPr>
+      <w:r>
+        <w:tab/>
+      </w:r>
+    </w:p>
+    <w:p>
+      <w:pPr>
+        <w:spacing w:after="0"/>
+      </w:pPr>
+      <w:r>
+        <w:tab/>
+        <w:t>macOS 15 "Sequoia"</w:t>
+      </w:r>
+    </w:p>
+    <w:p>
+      <w:pPr>
+        <w:spacing w:after="0"/>
+      </w:pPr>
+      <w:r>
+        <w:lastRenderedPageBreak/>
+        <w:tab/>
+        <w:t>macOS 14 "Sonoma"</w:t>
+      </w:r>
+    </w:p>
+    <w:p>
+      <w:pPr>
+        <w:spacing w:after="0"/>
+      </w:pPr>
+      <w:r>
+        <w:tab/>
+        <w:t>macOS 13 "Ventura"</w:t>
+      </w:r>
+    </w:p>
+    <w:p>
+      <w:pPr>
+        <w:spacing w:after="0"/>
+      </w:pPr>
+    </w:p>
+    <w:p>
+      <w:pPr>
+        <w:spacing w:after="0"/>
+      </w:pPr>
+      <w:r>
+        <w:t>There are several ways to install .NET 8 on macOS.  The following are the most common ways:</w:t>
+      </w:r>
+    </w:p>
+    <w:p>
+      <w:pPr>
+        <w:spacing w:after="0"/>
+      </w:pPr>
+    </w:p>
+    <w:p>
+      <w:pPr>
+        <w:pStyle w:val="Subtitle"/>
+      </w:pPr>
+      <w:r>
+        <w:t>Homebrew</w:t>
+      </w:r>
+    </w:p>
+    <w:p>
+      <w:pPr>
+        <w:spacing w:after="0"/>
+        <w:ind w:left="720"/>
+      </w:pPr>
+      <w:r>
+        <w:t>Homebrew is a free and open-source package manager for macOS.  If you don't have it installed</w:t>
+      </w:r>
+      <w:r>
         <w:t xml:space="preserve"> </w:t>
       </w:r>
-      <w:proofErr w:type="spellStart"/>
-      <w:r>
-        <w:rPr>
-          <w:rFonts w:ascii="Courier New" w:hAnsi="Courier New" w:cs="Courier New"/>
-          <w:sz w:val="18"/>
-          <w:szCs w:val="18"/>
-        </w:rPr>
-        <w:t>apk</w:t>
-      </w:r>
-      <w:proofErr w:type="spellEnd"/>
-      <w:r>
-        <w:rPr>
-          <w:rFonts w:ascii="Courier New" w:hAnsi="Courier New" w:cs="Courier New"/>
-          <w:sz w:val="18"/>
-          <w:szCs w:val="18"/>
-        </w:rPr>
-        <w:t xml:space="preserve"> add dotnet8-sdk</w:t>
-      </w:r>
-    </w:p>
-    <w:p>
-      <w:pPr>
-        <w:spacing w:after="0"/>
-      </w:pPr>
-      <w:r>
-        <w:t>CentOS Stream 8, 9</w:t>
-      </w:r>
-      <w:r>
-        <w:tab/>
-      </w:r>
-      <w:proofErr w:type="spellStart"/>
-      <w:r>
-        <w:rPr>
-          <w:rFonts w:ascii="Courier New" w:hAnsi="Courier New" w:cs="Courier New"/>
-          <w:sz w:val="18"/>
-          <w:szCs w:val="18"/>
-        </w:rPr>
-        <w:t>sudo</w:t>
-      </w:r>
-      <w:proofErr w:type="spellEnd"/>
-      <w:r>
-        <w:rPr>
-          <w:rFonts w:ascii="Courier New" w:hAnsi="Courier New" w:cs="Courier New"/>
-          <w:sz w:val="18"/>
-          <w:szCs w:val="18"/>
-        </w:rPr>
-        <w:t xml:space="preserve"> </w:t>
-      </w:r>
-      <w:proofErr w:type="spellStart"/>
-      <w:r>
-        <w:rPr>
-          <w:rFonts w:ascii="Courier New" w:hAnsi="Courier New" w:cs="Courier New"/>
-          <w:sz w:val="18"/>
-          <w:szCs w:val="18"/>
-        </w:rPr>
-        <w:t>dnf</w:t>
-      </w:r>
-      <w:proofErr w:type="spellEnd"/>
-      <w:r>
-        <w:rPr>
-          <w:rFonts w:ascii="Courier New" w:hAnsi="Courier New" w:cs="Courier New"/>
-          <w:sz w:val="18"/>
-          <w:szCs w:val="18"/>
-        </w:rPr>
-        <w:t xml:space="preserve"> install dotnet-runtime-8.0</w:t>
-      </w:r>
-    </w:p>
-    <w:p>
-      <w:pPr>
-        <w:spacing w:after="0"/>
-        <w:rPr>
-          <w:rFonts w:ascii="Courier New" w:hAnsi="Courier New" w:cs="Courier New"/>
-          <w:sz w:val="18"/>
-          <w:szCs w:val="18"/>
-        </w:rPr>
-      </w:pPr>
-      <w:r>
-        <w:t>RHEL 8, 9</w:t>
-      </w:r>
-      <w:r>
-        <w:tab/>
-      </w:r>
-      <w:r>
-        <w:tab/>
-      </w:r>
-      <w:proofErr w:type="spellStart"/>
-      <w:r>
-        <w:rPr>
-          <w:rFonts w:ascii="Courier New" w:hAnsi="Courier New" w:cs="Courier New"/>
-          <w:sz w:val="18"/>
-          <w:szCs w:val="18"/>
-        </w:rPr>
-        <w:t>sudo</w:t>
-      </w:r>
-      <w:proofErr w:type="spellEnd"/>
-      <w:r>
-        <w:rPr>
-          <w:rFonts w:ascii="Courier New" w:hAnsi="Courier New" w:cs="Courier New"/>
-          <w:sz w:val="18"/>
-          <w:szCs w:val="18"/>
-        </w:rPr>
-        <w:t xml:space="preserve"> </w:t>
-      </w:r>
-      <w:proofErr w:type="spellStart"/>
-      <w:r>
-        <w:rPr>
-          <w:rFonts w:ascii="Courier New" w:hAnsi="Courier New" w:cs="Courier New"/>
-          <w:sz w:val="18"/>
-          <w:szCs w:val="18"/>
-        </w:rPr>
-        <w:t>dnf</w:t>
-      </w:r>
-      <w:proofErr w:type="spellEnd"/>
-      <w:r>
-        <w:rPr>
-          <w:rFonts w:ascii="Courier New" w:hAnsi="Courier New" w:cs="Courier New"/>
-          <w:sz w:val="18"/>
-          <w:szCs w:val="18"/>
-        </w:rPr>
-        <w:t xml:space="preserve"> install dotnet-runtime-8.0</w:t>
-      </w:r>
-    </w:p>
-    <w:p>
-      <w:pPr>
-        <w:spacing w:after="0"/>
-      </w:pPr>
-    </w:p>
-    <w:p>
-      <w:pPr>
-        <w:spacing w:after="0"/>
-        <w:rPr>
-          <w:rFonts w:ascii="Courier New" w:hAnsi="Courier New" w:cs="Courier New"/>
-          <w:sz w:val="18"/>
-          <w:szCs w:val="18"/>
-        </w:rPr>
-      </w:pPr>
-      <w:r>
-        <w:t>Debian 12</w:t>
-      </w:r>
-      <w:r>
-        <w:tab/>
-      </w:r>
-      <w:r>
-        <w:tab/>
-      </w:r>
-      <w:proofErr w:type="spellStart"/>
-      <w:r>
-        <w:rPr>
-          <w:rFonts w:ascii="Courier New" w:hAnsi="Courier New" w:cs="Courier New"/>
-          <w:sz w:val="18"/>
-          <w:szCs w:val="18"/>
-        </w:rPr>
-        <w:t>wget</w:t>
-      </w:r>
-      <w:proofErr w:type="spellEnd"/>
-      <w:r>
-        <w:rPr>
-          <w:rFonts w:ascii="Courier New" w:hAnsi="Courier New" w:cs="Courier New"/>
-          <w:sz w:val="18"/>
-          <w:szCs w:val="18"/>
-        </w:rPr>
-        <w:t xml:space="preserve"> https://packages.microsoft.com/config/debian/12/packages-microsoft-prod.deb -O packages-</w:t>
-      </w:r>
-      <w:proofErr w:type="spellStart"/>
-      <w:r>
-        <w:rPr>
-          <w:rFonts w:ascii="Courier New" w:hAnsi="Courier New" w:cs="Courier New"/>
-          <w:sz w:val="18"/>
-          <w:szCs w:val="18"/>
-        </w:rPr>
-        <w:t>microsoft</w:t>
-      </w:r>
-      <w:proofErr w:type="spellEnd"/>
-      <w:r>
-        <w:rPr>
-          <w:rFonts w:ascii="Courier New" w:hAnsi="Courier New" w:cs="Courier New"/>
-          <w:sz w:val="18"/>
-          <w:szCs w:val="18"/>
-        </w:rPr>
-        <w:t>-</w:t>
-      </w:r>
-      <w:proofErr w:type="spellStart"/>
-      <w:r>
-        <w:rPr>
-          <w:rFonts w:ascii="Courier New" w:hAnsi="Courier New" w:cs="Courier New"/>
-          <w:sz w:val="18"/>
-          <w:szCs w:val="18"/>
-        </w:rPr>
-        <w:t>prod.deb</w:t>
-      </w:r>
-      <w:proofErr w:type="spellEnd"/>
-    </w:p>
-    <w:p>
-      <w:pPr>
-        <w:spacing w:after="0"/>
-        <w:rPr>
-          <w:rFonts w:ascii="Courier New" w:hAnsi="Courier New" w:cs="Courier New"/>
-          <w:sz w:val="18"/>
-          <w:szCs w:val="18"/>
-        </w:rPr>
-      </w:pPr>
-      <w:r>
-        <w:rPr>
-          <w:rFonts w:ascii="Courier New" w:hAnsi="Courier New" w:cs="Courier New"/>
-          <w:sz w:val="18"/>
-          <w:szCs w:val="18"/>
-        </w:rPr>
-        <w:tab/>
-      </w:r>
-      <w:r>
-        <w:rPr>
-          <w:rFonts w:ascii="Courier New" w:hAnsi="Courier New" w:cs="Courier New"/>
-          <w:sz w:val="18"/>
-          <w:szCs w:val="18"/>
-        </w:rPr>
-        <w:tab/>
-      </w:r>
-      <w:r>
-        <w:rPr>
-          <w:rFonts w:ascii="Courier New" w:hAnsi="Courier New" w:cs="Courier New"/>
-          <w:sz w:val="18"/>
-          <w:szCs w:val="18"/>
-        </w:rPr>
-        <w:tab/>
-      </w:r>
-      <w:proofErr w:type="spellStart"/>
-      <w:r>
-        <w:rPr>
-          <w:rFonts w:ascii="Courier New" w:hAnsi="Courier New" w:cs="Courier New"/>
-          <w:sz w:val="18"/>
-          <w:szCs w:val="18"/>
-        </w:rPr>
-        <w:t>sudo</w:t>
-      </w:r>
-      <w:proofErr w:type="spellEnd"/>
-      <w:r>
-        <w:rPr>
-          <w:rFonts w:ascii="Courier New" w:hAnsi="Courier New" w:cs="Courier New"/>
-          <w:sz w:val="18"/>
-          <w:szCs w:val="18"/>
-        </w:rPr>
-        <w:t xml:space="preserve"> </w:t>
-      </w:r>
-      <w:proofErr w:type="spellStart"/>
-      <w:r>
-        <w:rPr>
-          <w:rFonts w:ascii="Courier New" w:hAnsi="Courier New" w:cs="Courier New"/>
-          <w:sz w:val="18"/>
-          <w:szCs w:val="18"/>
-        </w:rPr>
-        <w:t>dpkg</w:t>
-      </w:r>
-      <w:proofErr w:type="spellEnd"/>
-      <w:r>
-        <w:rPr>
-          <w:rFonts w:ascii="Courier New" w:hAnsi="Courier New" w:cs="Courier New"/>
-          <w:sz w:val="18"/>
-          <w:szCs w:val="18"/>
-        </w:rPr>
-        <w:t xml:space="preserve"> -</w:t>
-      </w:r>
-      <w:proofErr w:type="spellStart"/>
-      <w:r>
-        <w:rPr>
-          <w:rFonts w:ascii="Courier New" w:hAnsi="Courier New" w:cs="Courier New"/>
-          <w:sz w:val="18"/>
-          <w:szCs w:val="18"/>
-        </w:rPr>
-        <w:t>i</w:t>
-      </w:r>
-      <w:proofErr w:type="spellEnd"/>
-      <w:r>
-        <w:rPr>
-          <w:rFonts w:ascii="Courier New" w:hAnsi="Courier New" w:cs="Courier New"/>
-          <w:sz w:val="18"/>
-          <w:szCs w:val="18"/>
-        </w:rPr>
-        <w:t xml:space="preserve"> packages-</w:t>
-      </w:r>
-      <w:proofErr w:type="spellStart"/>
-      <w:r>
-        <w:rPr>
-          <w:rFonts w:ascii="Courier New" w:hAnsi="Courier New" w:cs="Courier New"/>
-          <w:sz w:val="18"/>
-          <w:szCs w:val="18"/>
-        </w:rPr>
-        <w:t>microsoft</w:t>
-      </w:r>
-      <w:proofErr w:type="spellEnd"/>
-      <w:r>
-        <w:rPr>
-          <w:rFonts w:ascii="Courier New" w:hAnsi="Courier New" w:cs="Courier New"/>
-          <w:sz w:val="18"/>
-          <w:szCs w:val="18"/>
-        </w:rPr>
-        <w:t>-</w:t>
-      </w:r>
-      <w:proofErr w:type="spellStart"/>
-      <w:r>
-        <w:rPr>
-          <w:rFonts w:ascii="Courier New" w:hAnsi="Courier New" w:cs="Courier New"/>
-          <w:sz w:val="18"/>
-          <w:szCs w:val="18"/>
-        </w:rPr>
-        <w:t>prod.deb</w:t>
-      </w:r>
-      <w:proofErr w:type="spellEnd"/>
-    </w:p>
-    <w:p>
-      <w:pPr>
-        <w:spacing w:after="0"/>
-        <w:rPr>
-          <w:rFonts w:ascii="Courier New" w:hAnsi="Courier New" w:cs="Courier New"/>
-          <w:sz w:val="18"/>
-          <w:szCs w:val="18"/>
-        </w:rPr>
-      </w:pPr>
-      <w:r>
-        <w:rPr>
-          <w:rFonts w:ascii="Courier New" w:hAnsi="Courier New" w:cs="Courier New"/>
-          <w:sz w:val="18"/>
-          <w:szCs w:val="18"/>
-        </w:rPr>
-        <w:tab/>
-      </w:r>
-      <w:r>
-        <w:rPr>
-          <w:rFonts w:ascii="Courier New" w:hAnsi="Courier New" w:cs="Courier New"/>
-          <w:sz w:val="18"/>
-          <w:szCs w:val="18"/>
-        </w:rPr>
-        <w:tab/>
-      </w:r>
-      <w:r>
-        <w:rPr>
-          <w:rFonts w:ascii="Courier New" w:hAnsi="Courier New" w:cs="Courier New"/>
-          <w:sz w:val="18"/>
-          <w:szCs w:val="18"/>
-        </w:rPr>
-        <w:tab/>
-        <w:t>rm packages-</w:t>
-      </w:r>
-      <w:proofErr w:type="spellStart"/>
-      <w:r>
-        <w:rPr>
-          <w:rFonts w:ascii="Courier New" w:hAnsi="Courier New" w:cs="Courier New"/>
-          <w:sz w:val="18"/>
-          <w:szCs w:val="18"/>
-        </w:rPr>
-        <w:t>microsoft</w:t>
-      </w:r>
-      <w:proofErr w:type="spellEnd"/>
-      <w:r>
-        <w:rPr>
-          <w:rFonts w:ascii="Courier New" w:hAnsi="Courier New" w:cs="Courier New"/>
-          <w:sz w:val="18"/>
-          <w:szCs w:val="18"/>
-        </w:rPr>
-        <w:t>-</w:t>
-      </w:r>
-      <w:proofErr w:type="spellStart"/>
-      <w:r>
-        <w:rPr>
-          <w:rFonts w:ascii="Courier New" w:hAnsi="Courier New" w:cs="Courier New"/>
-          <w:sz w:val="18"/>
-          <w:szCs w:val="18"/>
-        </w:rPr>
-        <w:t>prod.deb</w:t>
-      </w:r>
-      <w:proofErr w:type="spellEnd"/>
-    </w:p>
-    <w:p>
-      <w:pPr>
-        <w:spacing w:after="0"/>
-        <w:rPr>
-          <w:rFonts w:ascii="Courier New" w:hAnsi="Courier New" w:cs="Courier New"/>
-          <w:sz w:val="18"/>
-          <w:szCs w:val="18"/>
-        </w:rPr>
-      </w:pPr>
-      <w:r>
-        <w:rPr>
-          <w:rFonts w:ascii="Courier New" w:hAnsi="Courier New" w:cs="Courier New"/>
-          <w:sz w:val="18"/>
-          <w:szCs w:val="18"/>
-        </w:rPr>
-        <w:tab/>
-      </w:r>
-      <w:r>
-        <w:rPr>
-          <w:rFonts w:ascii="Courier New" w:hAnsi="Courier New" w:cs="Courier New"/>
-          <w:sz w:val="18"/>
-          <w:szCs w:val="18"/>
-        </w:rPr>
-        <w:tab/>
-      </w:r>
-      <w:r>
-        <w:rPr>
-          <w:rFonts w:ascii="Courier New" w:hAnsi="Courier New" w:cs="Courier New"/>
-          <w:sz w:val="18"/>
-          <w:szCs w:val="18"/>
-        </w:rPr>
-        <w:tab/>
-      </w:r>
-      <w:proofErr w:type="spellStart"/>
-      <w:r>
-        <w:rPr>
-          <w:rFonts w:ascii="Courier New" w:hAnsi="Courier New" w:cs="Courier New"/>
-          <w:sz w:val="18"/>
-          <w:szCs w:val="18"/>
-        </w:rPr>
-        <w:t>sudo</w:t>
-      </w:r>
-      <w:proofErr w:type="spellEnd"/>
-      <w:r>
-        <w:rPr>
-          <w:rFonts w:ascii="Courier New" w:hAnsi="Courier New" w:cs="Courier New"/>
-          <w:sz w:val="18"/>
-          <w:szCs w:val="18"/>
-        </w:rPr>
-        <w:t xml:space="preserve"> apt-get update &amp;&amp; </w:t>
-      </w:r>
-      <w:proofErr w:type="spellStart"/>
-      <w:r>
-        <w:rPr>
-          <w:rFonts w:ascii="Courier New" w:hAnsi="Courier New" w:cs="Courier New"/>
-          <w:sz w:val="18"/>
-          <w:szCs w:val="18"/>
-        </w:rPr>
-        <w:t>sudo</w:t>
-      </w:r>
-      <w:proofErr w:type="spellEnd"/>
-      <w:r>
-        <w:rPr>
-          <w:rFonts w:ascii="Courier New" w:hAnsi="Courier New" w:cs="Courier New"/>
-          <w:sz w:val="18"/>
-          <w:szCs w:val="18"/>
-        </w:rPr>
-        <w:t xml:space="preserve"> apt-get install -y dotnet-sdk-8.0</w:t>
-      </w:r>
-    </w:p>
-    <w:p>
-      <w:pPr>
-        <w:spacing w:after="0"/>
-      </w:pPr>
-      <w:r>
-        <w:tab/>
-      </w:r>
-    </w:p>
-    <w:p>
-      <w:pPr>
-        <w:spacing w:after="0"/>
-        <w:rPr>
-          <w:rFonts w:ascii="Courier New" w:hAnsi="Courier New" w:cs="Courier New"/>
-          <w:sz w:val="18"/>
-          <w:szCs w:val="18"/>
-        </w:rPr>
-      </w:pPr>
-      <w:r>
-        <w:t>Fedora 40, 41</w:t>
-      </w:r>
-      <w:r>
-        <w:tab/>
-      </w:r>
-      <w:r>
-        <w:tab/>
-      </w:r>
-      <w:proofErr w:type="spellStart"/>
-      <w:r>
-        <w:rPr>
-          <w:rFonts w:ascii="Courier New" w:hAnsi="Courier New" w:cs="Courier New"/>
-          <w:sz w:val="18"/>
-          <w:szCs w:val="18"/>
-        </w:rPr>
-        <w:t>sudo</w:t>
-      </w:r>
-      <w:proofErr w:type="spellEnd"/>
-      <w:r>
-        <w:rPr>
-          <w:rFonts w:ascii="Courier New" w:hAnsi="Courier New" w:cs="Courier New"/>
-          <w:sz w:val="18"/>
-          <w:szCs w:val="18"/>
-        </w:rPr>
-        <w:t xml:space="preserve"> </w:t>
-      </w:r>
-      <w:proofErr w:type="spellStart"/>
-      <w:r>
-        <w:rPr>
-          <w:rFonts w:ascii="Courier New" w:hAnsi="Courier New" w:cs="Courier New"/>
-          <w:sz w:val="18"/>
-          <w:szCs w:val="18"/>
-        </w:rPr>
-        <w:t>dnf</w:t>
-      </w:r>
-      <w:proofErr w:type="spellEnd"/>
-      <w:r>
-        <w:rPr>
-          <w:rFonts w:ascii="Courier New" w:hAnsi="Courier New" w:cs="Courier New"/>
-          <w:sz w:val="18"/>
-          <w:szCs w:val="18"/>
-        </w:rPr>
-        <w:t xml:space="preserve"> install dotnet-runtime-8.0</w:t>
-      </w:r>
-    </w:p>
-    <w:p>
-      <w:pPr>
-        <w:spacing w:after="0"/>
-      </w:pPr>
-    </w:p>
-    <w:p>
-      <w:pPr>
-        <w:spacing w:after="0"/>
-        <w:rPr>
-          <w:rFonts w:ascii="Courier New" w:hAnsi="Courier New" w:cs="Courier New"/>
-          <w:sz w:val="18"/>
-          <w:szCs w:val="18"/>
-        </w:rPr>
-      </w:pPr>
-      <w:r>
-        <w:t>openSUSE Leap 15</w:t>
-      </w:r>
-      <w:r>
-        <w:tab/>
-      </w:r>
-      <w:proofErr w:type="spellStart"/>
-      <w:r>
-        <w:rPr>
-          <w:rFonts w:ascii="Courier New" w:hAnsi="Courier New" w:cs="Courier New"/>
-          <w:sz w:val="18"/>
-          <w:szCs w:val="18"/>
-        </w:rPr>
-        <w:t>sudo</w:t>
-      </w:r>
-      <w:proofErr w:type="spellEnd"/>
-      <w:r>
-        <w:rPr>
-          <w:rFonts w:ascii="Courier New" w:hAnsi="Courier New" w:cs="Courier New"/>
-          <w:sz w:val="18"/>
-          <w:szCs w:val="18"/>
-        </w:rPr>
-        <w:t xml:space="preserve"> </w:t>
-      </w:r>
-      <w:proofErr w:type="spellStart"/>
-      <w:r>
-        <w:rPr>
-          <w:rFonts w:ascii="Courier New" w:hAnsi="Courier New" w:cs="Courier New"/>
-          <w:sz w:val="18"/>
-          <w:szCs w:val="18"/>
-        </w:rPr>
-        <w:t>zypper</w:t>
-      </w:r>
-      <w:proofErr w:type="spellEnd"/>
-      <w:r>
-        <w:rPr>
-          <w:rFonts w:ascii="Courier New" w:hAnsi="Courier New" w:cs="Courier New"/>
-          <w:sz w:val="18"/>
-          <w:szCs w:val="18"/>
-        </w:rPr>
-        <w:t xml:space="preserve"> install </w:t>
-      </w:r>
-      <w:proofErr w:type="spellStart"/>
-      <w:r>
-        <w:rPr>
-          <w:rFonts w:ascii="Courier New" w:hAnsi="Courier New" w:cs="Courier New"/>
-          <w:sz w:val="18"/>
-          <w:szCs w:val="18"/>
-        </w:rPr>
-        <w:t>libicu</w:t>
-      </w:r>
-      <w:proofErr w:type="spellEnd"/>
-    </w:p>
-    <w:p>
-      <w:pPr>
-        <w:spacing w:after="0"/>
-        <w:rPr>
-          <w:rFonts w:ascii="Courier New" w:hAnsi="Courier New" w:cs="Courier New"/>
-          <w:sz w:val="18"/>
-          <w:szCs w:val="18"/>
-        </w:rPr>
-      </w:pPr>
-      <w:r>
-        <w:rPr>
-          <w:rFonts w:ascii="Courier New" w:hAnsi="Courier New" w:cs="Courier New"/>
-          <w:sz w:val="18"/>
-          <w:szCs w:val="18"/>
-        </w:rPr>
-        <w:tab/>
-      </w:r>
-      <w:r>
-        <w:rPr>
-          <w:rFonts w:ascii="Courier New" w:hAnsi="Courier New" w:cs="Courier New"/>
-          <w:sz w:val="18"/>
-          <w:szCs w:val="18"/>
-        </w:rPr>
-        <w:tab/>
-      </w:r>
-      <w:r>
-        <w:rPr>
-          <w:rFonts w:ascii="Courier New" w:hAnsi="Courier New" w:cs="Courier New"/>
-          <w:sz w:val="18"/>
-          <w:szCs w:val="18"/>
-        </w:rPr>
-        <w:tab/>
-      </w:r>
-      <w:proofErr w:type="spellStart"/>
-      <w:r>
-        <w:rPr>
-          <w:rFonts w:ascii="Courier New" w:hAnsi="Courier New" w:cs="Courier New"/>
-          <w:sz w:val="18"/>
-          <w:szCs w:val="18"/>
-        </w:rPr>
-        <w:t>sudo</w:t>
-      </w:r>
-      <w:proofErr w:type="spellEnd"/>
-      <w:r>
-        <w:rPr>
-          <w:rFonts w:ascii="Courier New" w:hAnsi="Courier New" w:cs="Courier New"/>
-          <w:sz w:val="18"/>
-          <w:szCs w:val="18"/>
-        </w:rPr>
-        <w:t xml:space="preserve"> rpm --import https://packages.microsoft.com/keys/microsoft.asc</w:t>
-      </w:r>
-    </w:p>
-    <w:p>
-      <w:pPr>
-        <w:spacing w:after="0"/>
-        <w:rPr>
-          <w:rFonts w:ascii="Courier New" w:hAnsi="Courier New" w:cs="Courier New"/>
-          <w:sz w:val="18"/>
-          <w:szCs w:val="18"/>
-        </w:rPr>
-      </w:pPr>
-      <w:r>
-        <w:rPr>
-          <w:rFonts w:ascii="Courier New" w:hAnsi="Courier New" w:cs="Courier New"/>
-          <w:sz w:val="18"/>
-          <w:szCs w:val="18"/>
-        </w:rPr>
-        <w:tab/>
-      </w:r>
-      <w:r>
-        <w:rPr>
-          <w:rFonts w:ascii="Courier New" w:hAnsi="Courier New" w:cs="Courier New"/>
-          <w:sz w:val="18"/>
-          <w:szCs w:val="18"/>
-        </w:rPr>
-        <w:tab/>
-      </w:r>
-      <w:r>
-        <w:rPr>
-          <w:rFonts w:ascii="Courier New" w:hAnsi="Courier New" w:cs="Courier New"/>
-          <w:sz w:val="18"/>
-          <w:szCs w:val="18"/>
-        </w:rPr>
-        <w:tab/>
-      </w:r>
-      <w:proofErr w:type="spellStart"/>
-      <w:r>
-        <w:rPr>
-          <w:rFonts w:ascii="Courier New" w:hAnsi="Courier New" w:cs="Courier New"/>
-          <w:sz w:val="18"/>
-          <w:szCs w:val="18"/>
-        </w:rPr>
-        <w:t>wget</w:t>
-      </w:r>
-      <w:proofErr w:type="spellEnd"/>
-      <w:r>
-        <w:rPr>
-          <w:rFonts w:ascii="Courier New" w:hAnsi="Courier New" w:cs="Courier New"/>
-          <w:sz w:val="18"/>
-          <w:szCs w:val="18"/>
-        </w:rPr>
-        <w:t xml:space="preserve"> https://packages.microsoft.com/config/opensuse/15/prod.repo</w:t>
-      </w:r>
-    </w:p>
-    <w:p>
-      <w:pPr>
-        <w:spacing w:after="0"/>
-        <w:rPr>
-          <w:rFonts w:ascii="Courier New" w:hAnsi="Courier New" w:cs="Courier New"/>
-          <w:sz w:val="18"/>
-          <w:szCs w:val="18"/>
-        </w:rPr>
-      </w:pPr>
-      <w:r>
-        <w:rPr>
-          <w:rFonts w:ascii="Courier New" w:hAnsi="Courier New" w:cs="Courier New"/>
-          <w:sz w:val="18"/>
-          <w:szCs w:val="18"/>
-        </w:rPr>
-        <w:tab/>
-      </w:r>
-      <w:r>
-        <w:rPr>
-          <w:rFonts w:ascii="Courier New" w:hAnsi="Courier New" w:cs="Courier New"/>
-          <w:sz w:val="18"/>
-          <w:szCs w:val="18"/>
-        </w:rPr>
-        <w:tab/>
-      </w:r>
-      <w:r>
-        <w:rPr>
-          <w:rFonts w:ascii="Courier New" w:hAnsi="Courier New" w:cs="Courier New"/>
-          <w:sz w:val="18"/>
-          <w:szCs w:val="18"/>
-        </w:rPr>
-        <w:tab/>
-      </w:r>
-      <w:proofErr w:type="spellStart"/>
-      <w:r>
-        <w:rPr>
-          <w:rFonts w:ascii="Courier New" w:hAnsi="Courier New" w:cs="Courier New"/>
-          <w:sz w:val="18"/>
-          <w:szCs w:val="18"/>
-        </w:rPr>
-        <w:t>sudo</w:t>
-      </w:r>
-      <w:proofErr w:type="spellEnd"/>
-      <w:r>
-        <w:rPr>
-          <w:rFonts w:ascii="Courier New" w:hAnsi="Courier New" w:cs="Courier New"/>
-          <w:sz w:val="18"/>
-          <w:szCs w:val="18"/>
-        </w:rPr>
-        <w:t xml:space="preserve"> mv </w:t>
-      </w:r>
-      <w:proofErr w:type="spellStart"/>
-      <w:proofErr w:type="gramStart"/>
-      <w:r>
-        <w:rPr>
-          <w:rFonts w:ascii="Courier New" w:hAnsi="Courier New" w:cs="Courier New"/>
-          <w:sz w:val="18"/>
-          <w:szCs w:val="18"/>
-        </w:rPr>
-        <w:t>prod.repo</w:t>
-      </w:r>
-      <w:proofErr w:type="spellEnd"/>
-      <w:proofErr w:type="gramEnd"/>
-      <w:r>
-        <w:rPr>
-          <w:rFonts w:ascii="Courier New" w:hAnsi="Courier New" w:cs="Courier New"/>
-          <w:sz w:val="18"/>
-          <w:szCs w:val="18"/>
-        </w:rPr>
-        <w:t xml:space="preserve"> /</w:t>
-      </w:r>
-      <w:proofErr w:type="spellStart"/>
-      <w:r>
-        <w:rPr>
-          <w:rFonts w:ascii="Courier New" w:hAnsi="Courier New" w:cs="Courier New"/>
-          <w:sz w:val="18"/>
-          <w:szCs w:val="18"/>
-        </w:rPr>
-        <w:t>etc</w:t>
-      </w:r>
-      <w:proofErr w:type="spellEnd"/>
-      <w:r>
-        <w:rPr>
-          <w:rFonts w:ascii="Courier New" w:hAnsi="Courier New" w:cs="Courier New"/>
-          <w:sz w:val="18"/>
-          <w:szCs w:val="18"/>
-        </w:rPr>
-        <w:t>/</w:t>
-      </w:r>
-      <w:proofErr w:type="spellStart"/>
-      <w:r>
-        <w:rPr>
-          <w:rFonts w:ascii="Courier New" w:hAnsi="Courier New" w:cs="Courier New"/>
-          <w:sz w:val="18"/>
-          <w:szCs w:val="18"/>
-        </w:rPr>
-        <w:t>zypp</w:t>
-      </w:r>
-      <w:proofErr w:type="spellEnd"/>
-      <w:r>
-        <w:rPr>
-          <w:rFonts w:ascii="Courier New" w:hAnsi="Courier New" w:cs="Courier New"/>
-          <w:sz w:val="18"/>
-          <w:szCs w:val="18"/>
-        </w:rPr>
-        <w:t>/</w:t>
-      </w:r>
-      <w:proofErr w:type="spellStart"/>
-      <w:r>
-        <w:rPr>
-          <w:rFonts w:ascii="Courier New" w:hAnsi="Courier New" w:cs="Courier New"/>
-          <w:sz w:val="18"/>
-          <w:szCs w:val="18"/>
-        </w:rPr>
-        <w:t>repos.d</w:t>
-      </w:r>
-      <w:proofErr w:type="spellEnd"/>
-      <w:r>
-        <w:rPr>
-          <w:rFonts w:ascii="Courier New" w:hAnsi="Courier New" w:cs="Courier New"/>
-          <w:sz w:val="18"/>
-          <w:szCs w:val="18"/>
-        </w:rPr>
-        <w:t>/</w:t>
-      </w:r>
-      <w:proofErr w:type="spellStart"/>
-      <w:r>
-        <w:rPr>
-          <w:rFonts w:ascii="Courier New" w:hAnsi="Courier New" w:cs="Courier New"/>
-          <w:sz w:val="18"/>
-          <w:szCs w:val="18"/>
-        </w:rPr>
-        <w:t>microsoft-prod.repo</w:t>
-      </w:r>
-      <w:proofErr w:type="spellEnd"/>
-    </w:p>
-    <w:p>
-      <w:pPr>
-        <w:spacing w:after="0"/>
-        <w:rPr>
-          <w:rFonts w:ascii="Courier New" w:hAnsi="Courier New" w:cs="Courier New"/>
-          <w:sz w:val="18"/>
-          <w:szCs w:val="18"/>
-        </w:rPr>
-      </w:pPr>
-      <w:r>
-        <w:rPr>
-          <w:rFonts w:ascii="Courier New" w:hAnsi="Courier New" w:cs="Courier New"/>
-          <w:sz w:val="18"/>
-          <w:szCs w:val="18"/>
-        </w:rPr>
-        <w:tab/>
-      </w:r>
-      <w:r>
-        <w:rPr>
-          <w:rFonts w:ascii="Courier New" w:hAnsi="Courier New" w:cs="Courier New"/>
-          <w:sz w:val="18"/>
-          <w:szCs w:val="18"/>
-        </w:rPr>
-        <w:tab/>
-      </w:r>
-      <w:r>
-        <w:rPr>
-          <w:rFonts w:ascii="Courier New" w:hAnsi="Courier New" w:cs="Courier New"/>
-          <w:sz w:val="18"/>
-          <w:szCs w:val="18"/>
-        </w:rPr>
-        <w:tab/>
-      </w:r>
-      <w:proofErr w:type="spellStart"/>
-      <w:r>
-        <w:rPr>
-          <w:rFonts w:ascii="Courier New" w:hAnsi="Courier New" w:cs="Courier New"/>
-          <w:sz w:val="18"/>
-          <w:szCs w:val="18"/>
-        </w:rPr>
-        <w:t>sudo</w:t>
-      </w:r>
-      <w:proofErr w:type="spellEnd"/>
-      <w:r>
-        <w:rPr>
-          <w:rFonts w:ascii="Courier New" w:hAnsi="Courier New" w:cs="Courier New"/>
-          <w:sz w:val="18"/>
-          <w:szCs w:val="18"/>
-        </w:rPr>
-        <w:t xml:space="preserve"> </w:t>
-      </w:r>
-      <w:proofErr w:type="spellStart"/>
-      <w:r>
-        <w:rPr>
-          <w:rFonts w:ascii="Courier New" w:hAnsi="Courier New" w:cs="Courier New"/>
-          <w:sz w:val="18"/>
-          <w:szCs w:val="18"/>
-        </w:rPr>
-        <w:t>chown</w:t>
-      </w:r>
-      <w:proofErr w:type="spellEnd"/>
-      <w:r>
-        <w:rPr>
-          <w:rFonts w:ascii="Courier New" w:hAnsi="Courier New" w:cs="Courier New"/>
-          <w:sz w:val="18"/>
-          <w:szCs w:val="18"/>
-        </w:rPr>
-        <w:t xml:space="preserve"> </w:t>
-      </w:r>
-      <w:proofErr w:type="spellStart"/>
-      <w:proofErr w:type="gramStart"/>
-      <w:r>
-        <w:rPr>
-          <w:rFonts w:ascii="Courier New" w:hAnsi="Courier New" w:cs="Courier New"/>
-          <w:sz w:val="18"/>
-          <w:szCs w:val="18"/>
-        </w:rPr>
-        <w:t>root:root</w:t>
-      </w:r>
-      <w:proofErr w:type="spellEnd"/>
-      <w:proofErr w:type="gramEnd"/>
-      <w:r>
-        <w:rPr>
-          <w:rFonts w:ascii="Courier New" w:hAnsi="Courier New" w:cs="Courier New"/>
-          <w:sz w:val="18"/>
-          <w:szCs w:val="18"/>
-        </w:rPr>
-        <w:t xml:space="preserve"> /</w:t>
-      </w:r>
-      <w:proofErr w:type="spellStart"/>
-      <w:r>
-        <w:rPr>
-          <w:rFonts w:ascii="Courier New" w:hAnsi="Courier New" w:cs="Courier New"/>
-          <w:sz w:val="18"/>
-          <w:szCs w:val="18"/>
-        </w:rPr>
-        <w:t>etc</w:t>
-      </w:r>
-      <w:proofErr w:type="spellEnd"/>
-      <w:r>
-        <w:rPr>
-          <w:rFonts w:ascii="Courier New" w:hAnsi="Courier New" w:cs="Courier New"/>
-          <w:sz w:val="18"/>
-          <w:szCs w:val="18"/>
-        </w:rPr>
-        <w:t>/</w:t>
-      </w:r>
-      <w:proofErr w:type="spellStart"/>
-      <w:r>
-        <w:rPr>
-          <w:rFonts w:ascii="Courier New" w:hAnsi="Courier New" w:cs="Courier New"/>
-          <w:sz w:val="18"/>
-          <w:szCs w:val="18"/>
-        </w:rPr>
-        <w:t>zypp</w:t>
-      </w:r>
-      <w:proofErr w:type="spellEnd"/>
-      <w:r>
-        <w:rPr>
-          <w:rFonts w:ascii="Courier New" w:hAnsi="Courier New" w:cs="Courier New"/>
-          <w:sz w:val="18"/>
-          <w:szCs w:val="18"/>
-        </w:rPr>
-        <w:t>/</w:t>
-      </w:r>
-      <w:proofErr w:type="spellStart"/>
-      <w:r>
-        <w:rPr>
-          <w:rFonts w:ascii="Courier New" w:hAnsi="Courier New" w:cs="Courier New"/>
-          <w:sz w:val="18"/>
-          <w:szCs w:val="18"/>
-        </w:rPr>
-        <w:t>repos.d</w:t>
-      </w:r>
-      <w:proofErr w:type="spellEnd"/>
-      <w:r>
-        <w:rPr>
-          <w:rFonts w:ascii="Courier New" w:hAnsi="Courier New" w:cs="Courier New"/>
-          <w:sz w:val="18"/>
-          <w:szCs w:val="18"/>
-        </w:rPr>
-        <w:t>/</w:t>
-      </w:r>
-      <w:proofErr w:type="spellStart"/>
-      <w:r>
-        <w:rPr>
-          <w:rFonts w:ascii="Courier New" w:hAnsi="Courier New" w:cs="Courier New"/>
-          <w:sz w:val="18"/>
-          <w:szCs w:val="18"/>
-        </w:rPr>
-        <w:t>microsoft-prod.repo</w:t>
-      </w:r>
-      <w:proofErr w:type="spellEnd"/>
-    </w:p>
-    <w:p>
-      <w:pPr>
-        <w:spacing w:after="0"/>
-        <w:rPr>
-          <w:rFonts w:ascii="Courier New" w:hAnsi="Courier New" w:cs="Courier New"/>
-          <w:sz w:val="18"/>
-          <w:szCs w:val="18"/>
-        </w:rPr>
-      </w:pPr>
-      <w:r>
-        <w:rPr>
-          <w:rFonts w:ascii="Courier New" w:hAnsi="Courier New" w:cs="Courier New"/>
-          <w:sz w:val="18"/>
-          <w:szCs w:val="18"/>
-        </w:rPr>
-        <w:tab/>
-      </w:r>
-      <w:r>
-        <w:rPr>
-          <w:rFonts w:ascii="Courier New" w:hAnsi="Courier New" w:cs="Courier New"/>
-          <w:sz w:val="18"/>
-          <w:szCs w:val="18"/>
-        </w:rPr>
-        <w:tab/>
-      </w:r>
-      <w:r>
-        <w:rPr>
-          <w:rFonts w:ascii="Courier New" w:hAnsi="Courier New" w:cs="Courier New"/>
-          <w:sz w:val="18"/>
-          <w:szCs w:val="18"/>
-        </w:rPr>
-        <w:tab/>
-      </w:r>
-      <w:proofErr w:type="spellStart"/>
-      <w:r>
-        <w:rPr>
-          <w:rFonts w:ascii="Courier New" w:hAnsi="Courier New" w:cs="Courier New"/>
-          <w:sz w:val="18"/>
-          <w:szCs w:val="18"/>
-        </w:rPr>
-        <w:t>sudo</w:t>
-      </w:r>
-      <w:proofErr w:type="spellEnd"/>
-      <w:r>
-        <w:rPr>
-          <w:rFonts w:ascii="Courier New" w:hAnsi="Courier New" w:cs="Courier New"/>
-          <w:sz w:val="18"/>
-          <w:szCs w:val="18"/>
-        </w:rPr>
-        <w:t xml:space="preserve"> </w:t>
-      </w:r>
-      <w:proofErr w:type="spellStart"/>
-      <w:r>
-        <w:rPr>
-          <w:rFonts w:ascii="Courier New" w:hAnsi="Courier New" w:cs="Courier New"/>
-          <w:sz w:val="18"/>
-          <w:szCs w:val="18"/>
-        </w:rPr>
-        <w:t>zypper</w:t>
-      </w:r>
-      <w:proofErr w:type="spellEnd"/>
-      <w:r>
-        <w:rPr>
-          <w:rFonts w:ascii="Courier New" w:hAnsi="Courier New" w:cs="Courier New"/>
-          <w:sz w:val="18"/>
-          <w:szCs w:val="18"/>
-        </w:rPr>
-        <w:t xml:space="preserve"> install dotnet-sdk-8.0</w:t>
-      </w:r>
-    </w:p>
-    <w:p>
-      <w:pPr>
-        <w:spacing w:after="0"/>
-      </w:pPr>
-    </w:p>
-    <w:p>
-      <w:pPr>
-        <w:spacing w:after="0"/>
-        <w:rPr>
-          <w:rFonts w:ascii="Courier New" w:hAnsi="Courier New" w:cs="Courier New"/>
-          <w:sz w:val="18"/>
-          <w:szCs w:val="18"/>
-        </w:rPr>
-      </w:pPr>
-      <w:r>
-        <w:t>SLES 15</w:t>
-      </w:r>
-      <w:r>
-        <w:tab/>
-      </w:r>
-      <w:r>
-        <w:tab/>
-      </w:r>
-      <w:proofErr w:type="spellStart"/>
-      <w:r>
-        <w:rPr>
-          <w:rFonts w:ascii="Courier New" w:hAnsi="Courier New" w:cs="Courier New"/>
-          <w:sz w:val="18"/>
-          <w:szCs w:val="18"/>
-        </w:rPr>
-        <w:t>sudo</w:t>
-      </w:r>
-      <w:proofErr w:type="spellEnd"/>
-      <w:r>
-        <w:rPr>
-          <w:rFonts w:ascii="Courier New" w:hAnsi="Courier New" w:cs="Courier New"/>
-          <w:sz w:val="18"/>
-          <w:szCs w:val="18"/>
-        </w:rPr>
-        <w:t xml:space="preserve"> rpm -</w:t>
-      </w:r>
-      <w:proofErr w:type="spellStart"/>
-      <w:r>
-        <w:rPr>
-          <w:rFonts w:ascii="Courier New" w:hAnsi="Courier New" w:cs="Courier New"/>
-          <w:sz w:val="18"/>
-          <w:szCs w:val="18"/>
-        </w:rPr>
-        <w:t>Uvh</w:t>
-      </w:r>
-      <w:proofErr w:type="spellEnd"/>
-      <w:r>
-        <w:rPr>
-          <w:rFonts w:ascii="Courier New" w:hAnsi="Courier New" w:cs="Courier New"/>
-          <w:sz w:val="18"/>
-          <w:szCs w:val="18"/>
-        </w:rPr>
-        <w:t xml:space="preserve"> https://packages.microsoft.com/config/sles/15/packages-microsoft-prod.rpm</w:t>
-      </w:r>
-    </w:p>
-    <w:p>
-      <w:pPr>
-        <w:spacing w:after="0"/>
-        <w:rPr>
-          <w:rFonts w:ascii="Courier New" w:hAnsi="Courier New" w:cs="Courier New"/>
-          <w:sz w:val="18"/>
-          <w:szCs w:val="18"/>
-        </w:rPr>
-      </w:pPr>
-      <w:r>
-        <w:rPr>
-          <w:rFonts w:ascii="Courier New" w:hAnsi="Courier New" w:cs="Courier New"/>
-          <w:sz w:val="18"/>
-          <w:szCs w:val="18"/>
-        </w:rPr>
-        <w:tab/>
-      </w:r>
-      <w:r>
-        <w:rPr>
-          <w:rFonts w:ascii="Courier New" w:hAnsi="Courier New" w:cs="Courier New"/>
-          <w:sz w:val="18"/>
-          <w:szCs w:val="18"/>
-        </w:rPr>
-        <w:tab/>
-      </w:r>
-      <w:r>
-        <w:rPr>
-          <w:rFonts w:ascii="Courier New" w:hAnsi="Courier New" w:cs="Courier New"/>
-          <w:sz w:val="18"/>
-          <w:szCs w:val="18"/>
-        </w:rPr>
-        <w:tab/>
-      </w:r>
-      <w:proofErr w:type="spellStart"/>
-      <w:r>
-        <w:rPr>
-          <w:rFonts w:ascii="Courier New" w:hAnsi="Courier New" w:cs="Courier New"/>
-          <w:sz w:val="18"/>
-          <w:szCs w:val="18"/>
-        </w:rPr>
-        <w:t>sudo</w:t>
-      </w:r>
-      <w:proofErr w:type="spellEnd"/>
-      <w:r>
-        <w:rPr>
-          <w:rFonts w:ascii="Courier New" w:hAnsi="Courier New" w:cs="Courier New"/>
-          <w:sz w:val="18"/>
-          <w:szCs w:val="18"/>
-        </w:rPr>
-        <w:t xml:space="preserve"> </w:t>
-      </w:r>
-      <w:proofErr w:type="spellStart"/>
-      <w:r>
-        <w:rPr>
-          <w:rFonts w:ascii="Courier New" w:hAnsi="Courier New" w:cs="Courier New"/>
-          <w:sz w:val="18"/>
-          <w:szCs w:val="18"/>
-        </w:rPr>
-        <w:t>zypper</w:t>
-      </w:r>
-      <w:proofErr w:type="spellEnd"/>
-      <w:r>
-        <w:rPr>
-          <w:rFonts w:ascii="Courier New" w:hAnsi="Courier New" w:cs="Courier New"/>
-          <w:sz w:val="18"/>
-          <w:szCs w:val="18"/>
-        </w:rPr>
-        <w:t xml:space="preserve"> install dotnet-runtime-8.0</w:t>
-      </w:r>
-    </w:p>
-    <w:p>
-      <w:pPr>
-        <w:spacing w:after="0"/>
-      </w:pPr>
-    </w:p>
-    <w:p>
-      <w:pPr>
-        <w:pStyle w:val="Heading3"/>
-      </w:pPr>
-      <w:bookmarkStart w:id="4" w:name="_Toc200005795"/>
-      <w:r>
-        <w:t>SPECIAL INSTRUCTIONS FOR MAC OS</w:t>
-      </w:r>
-      <w:bookmarkEnd w:id="4"/>
-    </w:p>
-    <w:p>
-      <w:pPr>
-        <w:spacing w:after="0"/>
-      </w:pPr>
-    </w:p>
-    <w:p>
-      <w:pPr>
-        <w:spacing w:after="0"/>
-      </w:pPr>
-      <w:r>
-        <w:t>The following versions of macOS are supported by Microsoft for .NET 8.0</w:t>
-      </w:r>
-    </w:p>
-    <w:p>
-      <w:pPr>
-        <w:spacing w:after="0"/>
-      </w:pPr>
-      <w:r>
-        <w:tab/>
-      </w:r>
-    </w:p>
-    <w:p>
-      <w:pPr>
-        <w:spacing w:after="0"/>
-      </w:pPr>
-      <w:r>
-        <w:tab/>
-        <w:t>macOS 15 "Sequoia"</w:t>
-      </w:r>
-    </w:p>
-    <w:p>
-      <w:pPr>
-        <w:spacing w:after="0"/>
-      </w:pPr>
-      <w:r>
-        <w:lastRenderedPageBreak/>
-        <w:tab/>
-        <w:t>macOS 14 "Sonoma"</w:t>
-      </w:r>
-    </w:p>
-    <w:p>
-      <w:pPr>
-        <w:spacing w:after="0"/>
-      </w:pPr>
-      <w:r>
-        <w:tab/>
-        <w:t>macOS 13 "Ventura"</w:t>
-      </w:r>
-    </w:p>
-    <w:p>
-      <w:pPr>
-        <w:spacing w:after="0"/>
-      </w:pPr>
-    </w:p>
-    <w:p>
-      <w:pPr>
-        <w:spacing w:after="0"/>
-      </w:pPr>
-      <w:r>
-        <w:t>There are several ways to install .NET 8 on macOS.  The following are the most common ways:</w:t>
-      </w:r>
-    </w:p>
-    <w:p>
-      <w:pPr>
-        <w:spacing w:after="0"/>
-      </w:pPr>
-    </w:p>
-    <w:p>
-      <w:pPr>
-        <w:pStyle w:val="Subtitle"/>
-      </w:pPr>
-      <w:r>
-        <w:t>Homebrew</w:t>
-      </w:r>
-    </w:p>
-    <w:p>
-      <w:pPr>
-        <w:spacing w:after="0"/>
-        <w:ind w:left="720"/>
-      </w:pPr>
-      <w:r>
-        <w:t>Homebrew is a free and open-source package manager for macOS.  If you don't have it installed</w:t>
-      </w:r>
-      <w:r>
-        <w:t xml:space="preserve"> </w:t>
-      </w:r>
-      <w:r>
-        <w:t xml:space="preserve">but would </w:t>
-      </w:r>
-      <w:proofErr w:type="gramStart"/>
-      <w:r>
-        <w:t>like</w:t>
-      </w:r>
-      <w:proofErr w:type="gramEnd"/>
-      <w:r>
-        <w:t xml:space="preserve"> to, it can be obtained from the following web site:</w:t>
+      <w:r>
+        <w:t>but would like to, it can be obtained from the following web site:</w:t>
       </w:r>
     </w:p>
     <w:p>
@@ -2944,15 +2068,7 @@
     <w:p/>
     <w:p>
       <w:r>
-        <w:t xml:space="preserve">The basic syntax of the command line follows.  The only required line items are the mod directory and the </w:t>
-      </w:r>
-      <w:proofErr w:type="gramStart"/>
-      <w:r>
-        <w:t>prefix,</w:t>
-      </w:r>
-      <w:proofErr w:type="gramEnd"/>
-      <w:r>
-        <w:t xml:space="preserve"> all other options are optional:</w:t>
+        <w:t>The basic syntax of the command line follows.  The only required line items are the mod directory and the prefix, all other options are optional:</w:t>
       </w:r>
     </w:p>
     <w:p>
@@ -2971,50 +2087,14 @@
         <w:rPr>
           <w:rFonts w:ascii="Courier New" w:hAnsi="Courier New" w:cs="Courier New"/>
         </w:rPr>
-        <w:t>ocalizer.cmd &lt;</w:t>
-      </w:r>
-      <w:proofErr w:type="spellStart"/>
-      <w:r>
-        <w:rPr>
-          <w:rFonts w:ascii="Courier New" w:hAnsi="Courier New" w:cs="Courier New"/>
-        </w:rPr>
-        <w:t>ModDirectory</w:t>
-      </w:r>
-      <w:proofErr w:type="spellEnd"/>
-      <w:r>
-        <w:rPr>
-          <w:rFonts w:ascii="Courier New" w:hAnsi="Courier New" w:cs="Courier New"/>
-        </w:rPr>
-        <w:t>&gt; --prefix=&lt;prefix&gt;</w:t>
-      </w:r>
-      <w:r>
-        <w:rPr>
-          <w:rFonts w:ascii="Courier New" w:hAnsi="Courier New" w:cs="Courier New"/>
-        </w:rPr>
-        <w:t xml:space="preserve"> </w:t>
-      </w:r>
-      <w:proofErr w:type="gramStart"/>
-      <w:r>
-        <w:rPr>
-          <w:rFonts w:ascii="Courier New" w:hAnsi="Courier New" w:cs="Courier New"/>
-        </w:rPr>
-        <w:t>[ optional</w:t>
-      </w:r>
-      <w:proofErr w:type="gramEnd"/>
-      <w:r>
-        <w:rPr>
-          <w:rFonts w:ascii="Courier New" w:hAnsi="Courier New" w:cs="Courier New"/>
-        </w:rPr>
-        <w:t xml:space="preserve"> options</w:t>
-      </w:r>
-      <w:proofErr w:type="gramStart"/>
-      <w:r>
-        <w:rPr>
-          <w:rFonts w:ascii="Courier New" w:hAnsi="Courier New" w:cs="Courier New"/>
-        </w:rPr>
-        <w:t>&gt; ]</w:t>
-      </w:r>
-      <w:proofErr w:type="gramEnd"/>
+        <w:t>ocalizer.cmd &lt;ModDirectory&gt; --prefix=&lt;prefix&gt;</w:t>
+      </w:r>
+      <w:r>
+        <w:rPr>
+          <w:rFonts w:ascii="Courier New" w:hAnsi="Courier New" w:cs="Courier New"/>
+        </w:rPr>
+        <w:t xml:space="preserve"> [ optional options&gt; ]</w:t>
+      </w:r>
     </w:p>
     <w:p>
       <w:pPr>
@@ -3039,52 +2119,16 @@
           <w:sz w:val="20"/>
           <w:szCs w:val="20"/>
         </w:rPr>
-        <w:t>--</w:t>
-      </w:r>
-      <w:proofErr w:type="spellStart"/>
-      <w:r>
-        <w:rPr>
-          <w:rFonts w:ascii="Courier New" w:hAnsi="Courier New" w:cs="Courier New"/>
-          <w:sz w:val="20"/>
-          <w:szCs w:val="20"/>
-        </w:rPr>
-        <w:t>outdir</w:t>
-      </w:r>
-      <w:proofErr w:type="spellEnd"/>
-      <w:r>
-        <w:rPr>
-          <w:rFonts w:ascii="Courier New" w:hAnsi="Courier New" w:cs="Courier New"/>
-          <w:sz w:val="20"/>
-          <w:szCs w:val="20"/>
-        </w:rPr>
-        <w:t>=&lt;path&gt;</w:t>
-      </w:r>
-      <w:r>
-        <w:rPr>
-          <w:rFonts w:ascii="Courier New" w:hAnsi="Courier New" w:cs="Courier New"/>
-          <w:sz w:val="20"/>
-          <w:szCs w:val="20"/>
-        </w:rPr>
-        <w:tab/>
-        <w:t>Output path for `</w:t>
-      </w:r>
-      <w:proofErr w:type="spellStart"/>
-      <w:r>
-        <w:rPr>
-          <w:rFonts w:ascii="Courier New" w:hAnsi="Courier New" w:cs="Courier New"/>
-          <w:sz w:val="20"/>
-          <w:szCs w:val="20"/>
-        </w:rPr>
-        <w:t>en-us.cfg</w:t>
-      </w:r>
-      <w:proofErr w:type="spellEnd"/>
-      <w:r>
-        <w:rPr>
-          <w:rFonts w:ascii="Courier New" w:hAnsi="Courier New" w:cs="Courier New"/>
-          <w:sz w:val="20"/>
-          <w:szCs w:val="20"/>
-        </w:rPr>
-        <w:t>` and en-us.csv files</w:t>
+        <w:t>--outdir=&lt;path&gt;</w:t>
+      </w:r>
+      <w:r>
+        <w:rPr>
+          <w:rFonts w:ascii="Courier New" w:hAnsi="Courier New" w:cs="Courier New"/>
+          <w:sz w:val="20"/>
+          <w:szCs w:val="20"/>
+        </w:rPr>
+        <w:tab/>
+        <w:t>Output path for `en-us.cfg` and en-us.csv files</w:t>
       </w:r>
     </w:p>
     <w:p>
@@ -3112,25 +2156,7 @@
           <w:szCs w:val="20"/>
         </w:rPr>
         <w:tab/>
-        <w:t>Localization key prefix (default: `</w:t>
-      </w:r>
-      <w:proofErr w:type="spellStart"/>
-      <w:r>
-        <w:rPr>
-          <w:rFonts w:ascii="Courier New" w:hAnsi="Courier New" w:cs="Courier New"/>
-          <w:sz w:val="20"/>
-          <w:szCs w:val="20"/>
-        </w:rPr>
-        <w:t>MyMod</w:t>
-      </w:r>
-      <w:proofErr w:type="spellEnd"/>
-      <w:r>
-        <w:rPr>
-          <w:rFonts w:ascii="Courier New" w:hAnsi="Courier New" w:cs="Courier New"/>
-          <w:sz w:val="20"/>
-          <w:szCs w:val="20"/>
-        </w:rPr>
-        <w:t xml:space="preserve">_`) </w:t>
+        <w:t xml:space="preserve">Localization key prefix (default: `MyMod_`) </w:t>
       </w:r>
     </w:p>
     <w:p>
@@ -3149,25 +2175,7 @@
           <w:sz w:val="20"/>
           <w:szCs w:val="20"/>
         </w:rPr>
-        <w:t>--</w:t>
-      </w:r>
-      <w:proofErr w:type="spellStart"/>
-      <w:r>
-        <w:rPr>
-          <w:rFonts w:ascii="Courier New" w:hAnsi="Courier New" w:cs="Courier New"/>
-          <w:sz w:val="20"/>
-          <w:szCs w:val="20"/>
-        </w:rPr>
-        <w:t>maxkeylength</w:t>
-      </w:r>
-      <w:proofErr w:type="spellEnd"/>
-      <w:r>
-        <w:rPr>
-          <w:rFonts w:ascii="Courier New" w:hAnsi="Courier New" w:cs="Courier New"/>
-          <w:sz w:val="20"/>
-          <w:szCs w:val="20"/>
-        </w:rPr>
-        <w:t>=&lt;number&gt;</w:t>
+        <w:t>--maxkeylength=&lt;number&gt;</w:t>
       </w:r>
       <w:r>
         <w:rPr>
@@ -3195,18 +2203,8 @@
           <w:sz w:val="20"/>
           <w:szCs w:val="20"/>
         </w:rPr>
-        <w:t>--</w:t>
-      </w:r>
-      <w:proofErr w:type="spellStart"/>
-      <w:r>
-        <w:rPr>
-          <w:rFonts w:ascii="Courier New" w:hAnsi="Courier New" w:cs="Courier New"/>
-          <w:sz w:val="20"/>
-          <w:szCs w:val="20"/>
-        </w:rPr>
-        <w:t>numerictags</w:t>
-      </w:r>
-      <w:proofErr w:type="spellEnd"/>
+        <w:t>--numerictags</w:t>
+      </w:r>
       <w:r>
         <w:rPr>
           <w:rFonts w:ascii="Courier New" w:hAnsi="Courier New" w:cs="Courier New"/>
@@ -3233,18 +2231,8 @@
           <w:sz w:val="20"/>
           <w:szCs w:val="20"/>
         </w:rPr>
-        <w:t>--</w:t>
-      </w:r>
-      <w:proofErr w:type="spellStart"/>
-      <w:r>
-        <w:rPr>
-          <w:rFonts w:ascii="Courier New" w:hAnsi="Courier New" w:cs="Courier New"/>
-          <w:sz w:val="20"/>
-          <w:szCs w:val="20"/>
-        </w:rPr>
-        <w:t>separatePartsCfg</w:t>
-      </w:r>
-      <w:proofErr w:type="spellEnd"/>
+        <w:t>--separatePartsCfg</w:t>
+      </w:r>
       <w:r>
         <w:rPr>
           <w:rFonts w:ascii="Courier New" w:hAnsi="Courier New" w:cs="Courier New"/>
@@ -3271,25 +2259,7 @@
           <w:sz w:val="20"/>
           <w:szCs w:val="20"/>
         </w:rPr>
-        <w:t>--</w:t>
-      </w:r>
-      <w:proofErr w:type="spellStart"/>
-      <w:r>
-        <w:rPr>
-          <w:rFonts w:ascii="Courier New" w:hAnsi="Courier New" w:cs="Courier New"/>
-          <w:sz w:val="20"/>
-          <w:szCs w:val="20"/>
-        </w:rPr>
-        <w:t>inifile</w:t>
-      </w:r>
-      <w:proofErr w:type="spellEnd"/>
-      <w:r>
-        <w:rPr>
-          <w:rFonts w:ascii="Courier New" w:hAnsi="Courier New" w:cs="Courier New"/>
-          <w:sz w:val="20"/>
-          <w:szCs w:val="20"/>
-        </w:rPr>
-        <w:t>=&lt;file&gt;</w:t>
+        <w:t>--inifile=&lt;file&gt;</w:t>
       </w:r>
       <w:r>
         <w:rPr>
@@ -3313,43 +2283,7 @@
           <w:sz w:val="20"/>
           <w:szCs w:val="20"/>
         </w:rPr>
-        <w:t xml:space="preserve">pecify </w:t>
-      </w:r>
-      <w:proofErr w:type="gramStart"/>
-      <w:r>
-        <w:rPr>
-          <w:rFonts w:ascii="Courier New" w:hAnsi="Courier New" w:cs="Courier New"/>
-          <w:sz w:val="20"/>
-          <w:szCs w:val="20"/>
-        </w:rPr>
-        <w:t>a</w:t>
-      </w:r>
-      <w:proofErr w:type="gramEnd"/>
-      <w:r>
-        <w:rPr>
-          <w:rFonts w:ascii="Courier New" w:hAnsi="Courier New" w:cs="Courier New"/>
-          <w:sz w:val="20"/>
-          <w:szCs w:val="20"/>
-        </w:rPr>
-        <w:t xml:space="preserve"> </w:t>
-      </w:r>
-      <w:proofErr w:type="spellStart"/>
-      <w:r>
-        <w:rPr>
-          <w:rFonts w:ascii="Courier New" w:hAnsi="Courier New" w:cs="Courier New"/>
-          <w:sz w:val="20"/>
-          <w:szCs w:val="20"/>
-        </w:rPr>
-        <w:t>ini</w:t>
-      </w:r>
-      <w:proofErr w:type="spellEnd"/>
-      <w:r>
-        <w:rPr>
-          <w:rFonts w:ascii="Courier New" w:hAnsi="Courier New" w:cs="Courier New"/>
-          <w:sz w:val="20"/>
-          <w:szCs w:val="20"/>
-        </w:rPr>
-        <w:t xml:space="preserve"> file which contains include and exclude strings (example below</w:t>
+        <w:t>pecify a ini file which contains include and exclude strings (example below</w:t>
       </w:r>
     </w:p>
     <w:p>
@@ -3368,18 +2302,8 @@
           <w:sz w:val="20"/>
           <w:szCs w:val="20"/>
         </w:rPr>
-        <w:t>--</w:t>
-      </w:r>
-      <w:proofErr w:type="spellStart"/>
-      <w:r>
-        <w:rPr>
-          <w:rFonts w:ascii="Courier New" w:hAnsi="Courier New" w:cs="Courier New"/>
-          <w:sz w:val="20"/>
-          <w:szCs w:val="20"/>
-        </w:rPr>
-        <w:t>csonly</w:t>
-      </w:r>
-      <w:proofErr w:type="spellEnd"/>
+        <w:t>--csonly</w:t>
+      </w:r>
       <w:r>
         <w:rPr>
           <w:rFonts w:ascii="Courier New" w:hAnsi="Courier New" w:cs="Courier New"/>
@@ -3406,51 +2330,23 @@
           <w:sz w:val="20"/>
           <w:szCs w:val="20"/>
         </w:rPr>
-        <w:t>--</w:t>
-      </w:r>
-      <w:proofErr w:type="spellStart"/>
-      <w:r>
-        <w:rPr>
-          <w:rFonts w:ascii="Courier New" w:hAnsi="Courier New" w:cs="Courier New"/>
-          <w:sz w:val="20"/>
-          <w:szCs w:val="20"/>
-        </w:rPr>
-        <w:t>cfgonly</w:t>
-      </w:r>
-      <w:proofErr w:type="spellEnd"/>
-      <w:r>
-        <w:rPr>
-          <w:rFonts w:ascii="Courier New" w:hAnsi="Courier New" w:cs="Courier New"/>
-          <w:sz w:val="20"/>
-          <w:szCs w:val="20"/>
-        </w:rPr>
-        <w:tab/>
-      </w:r>
-      <w:r>
-        <w:rPr>
-          <w:rFonts w:ascii="Courier New" w:hAnsi="Courier New" w:cs="Courier New"/>
-          <w:sz w:val="20"/>
-          <w:szCs w:val="20"/>
-        </w:rPr>
-        <w:t>Only process .</w:t>
-      </w:r>
-      <w:proofErr w:type="spellStart"/>
-      <w:r>
-        <w:rPr>
-          <w:rFonts w:ascii="Courier New" w:hAnsi="Courier New" w:cs="Courier New"/>
-          <w:sz w:val="20"/>
-          <w:szCs w:val="20"/>
-        </w:rPr>
-        <w:t>cfg</w:t>
-      </w:r>
-      <w:proofErr w:type="spellEnd"/>
-      <w:r>
-        <w:rPr>
-          <w:rFonts w:ascii="Courier New" w:hAnsi="Courier New" w:cs="Courier New"/>
-          <w:sz w:val="20"/>
-          <w:szCs w:val="20"/>
-        </w:rPr>
-        <w:t xml:space="preserve"> files</w:t>
+        <w:t>--cfgonly</w:t>
+      </w:r>
+      <w:r>
+        <w:rPr>
+          <w:rFonts w:ascii="Courier New" w:hAnsi="Courier New" w:cs="Courier New"/>
+          <w:sz w:val="20"/>
+          <w:szCs w:val="20"/>
+        </w:rPr>
+        <w:tab/>
+      </w:r>
+      <w:r>
+        <w:rPr>
+          <w:rFonts w:ascii="Courier New" w:hAnsi="Courier New" w:cs="Courier New"/>
+          <w:sz w:val="20"/>
+          <w:szCs w:val="20"/>
+        </w:rPr>
+        <w:t>Only process .cfg files</w:t>
       </w:r>
     </w:p>
     <w:p>
@@ -3469,41 +2365,16 @@
           <w:sz w:val="20"/>
           <w:szCs w:val="20"/>
         </w:rPr>
-        <w:t>--revert</w:t>
-      </w:r>
-      <w:r>
-        <w:rPr>
-          <w:rFonts w:ascii="Courier New" w:hAnsi="Courier New" w:cs="Courier New"/>
-          <w:sz w:val="20"/>
-          <w:szCs w:val="20"/>
-        </w:rPr>
-        <w:tab/>
-      </w:r>
-      <w:r>
-        <w:rPr>
-          <w:rFonts w:ascii="Courier New" w:hAnsi="Courier New" w:cs="Courier New"/>
-          <w:sz w:val="20"/>
-          <w:szCs w:val="20"/>
-        </w:rPr>
-        <w:t>Restores the original files from the .</w:t>
-      </w:r>
-      <w:proofErr w:type="spellStart"/>
-      <w:r>
-        <w:rPr>
-          <w:rFonts w:ascii="Courier New" w:hAnsi="Courier New" w:cs="Courier New"/>
-          <w:sz w:val="20"/>
-          <w:szCs w:val="20"/>
-        </w:rPr>
-        <w:t>bak</w:t>
-      </w:r>
-      <w:proofErr w:type="spellEnd"/>
-      <w:r>
-        <w:rPr>
-          <w:rFonts w:ascii="Courier New" w:hAnsi="Courier New" w:cs="Courier New"/>
-          <w:sz w:val="20"/>
-          <w:szCs w:val="20"/>
-        </w:rPr>
-        <w:t xml:space="preserve"> files</w:t>
+        <w:t>--excludedir=&lt;dir&gt;</w:t>
+      </w:r>
+      <w:r>
+        <w:rPr>
+          <w:rFonts w:ascii="Courier New" w:hAnsi="Courier New" w:cs="Courier New"/>
+          <w:sz w:val="20"/>
+          <w:szCs w:val="20"/>
+        </w:rPr>
+        <w:tab/>
+        <w:t>Specifies a directory to exclude.  This can be either a partial or full path (starting at the &lt;ModDirectory&gt; level.  Note:  Recommend that you surround directory names with slashes to ensure no partial match will happen</w:t>
       </w:r>
     </w:p>
     <w:p>
@@ -3522,51 +2393,23 @@
           <w:sz w:val="20"/>
           <w:szCs w:val="20"/>
         </w:rPr>
-        <w:t>--</w:t>
-      </w:r>
-      <w:proofErr w:type="spellStart"/>
-      <w:r>
-        <w:rPr>
-          <w:rFonts w:ascii="Courier New" w:hAnsi="Courier New" w:cs="Courier New"/>
-          <w:sz w:val="20"/>
-          <w:szCs w:val="20"/>
-        </w:rPr>
-        <w:t>cleanbak</w:t>
-      </w:r>
-      <w:proofErr w:type="spellEnd"/>
-      <w:r>
-        <w:rPr>
-          <w:rFonts w:ascii="Courier New" w:hAnsi="Courier New" w:cs="Courier New"/>
-          <w:sz w:val="20"/>
-          <w:szCs w:val="20"/>
-        </w:rPr>
-        <w:tab/>
-      </w:r>
-      <w:r>
-        <w:rPr>
-          <w:rFonts w:ascii="Courier New" w:hAnsi="Courier New" w:cs="Courier New"/>
-          <w:sz w:val="20"/>
-          <w:szCs w:val="20"/>
-        </w:rPr>
-        <w:t>Deletes all the .</w:t>
-      </w:r>
-      <w:proofErr w:type="spellStart"/>
-      <w:r>
-        <w:rPr>
-          <w:rFonts w:ascii="Courier New" w:hAnsi="Courier New" w:cs="Courier New"/>
-          <w:sz w:val="20"/>
-          <w:szCs w:val="20"/>
-        </w:rPr>
-        <w:t>bak</w:t>
-      </w:r>
-      <w:proofErr w:type="spellEnd"/>
-      <w:r>
-        <w:rPr>
-          <w:rFonts w:ascii="Courier New" w:hAnsi="Courier New" w:cs="Courier New"/>
-          <w:sz w:val="20"/>
-          <w:szCs w:val="20"/>
-        </w:rPr>
-        <w:t xml:space="preserve"> files</w:t>
+        <w:t>--revert</w:t>
+      </w:r>
+      <w:r>
+        <w:rPr>
+          <w:rFonts w:ascii="Courier New" w:hAnsi="Courier New" w:cs="Courier New"/>
+          <w:sz w:val="20"/>
+          <w:szCs w:val="20"/>
+        </w:rPr>
+        <w:tab/>
+      </w:r>
+      <w:r>
+        <w:rPr>
+          <w:rFonts w:ascii="Courier New" w:hAnsi="Courier New" w:cs="Courier New"/>
+          <w:sz w:val="20"/>
+          <w:szCs w:val="20"/>
+        </w:rPr>
+        <w:t>Restores the original files from the .bak files</w:t>
       </w:r>
     </w:p>
     <w:p>
@@ -3585,18 +2428,43 @@
           <w:sz w:val="20"/>
           <w:szCs w:val="20"/>
         </w:rPr>
-        <w:t>--</w:t>
-      </w:r>
-      <w:proofErr w:type="gramStart"/>
-      <w:r>
-        <w:rPr>
-          <w:rFonts w:ascii="Courier New" w:hAnsi="Courier New" w:cs="Courier New"/>
-          <w:sz w:val="20"/>
-          <w:szCs w:val="20"/>
-        </w:rPr>
-        <w:t>help</w:t>
-      </w:r>
-      <w:proofErr w:type="gramEnd"/>
+        <w:t>--cleanbak</w:t>
+      </w:r>
+      <w:r>
+        <w:rPr>
+          <w:rFonts w:ascii="Courier New" w:hAnsi="Courier New" w:cs="Courier New"/>
+          <w:sz w:val="20"/>
+          <w:szCs w:val="20"/>
+        </w:rPr>
+        <w:tab/>
+      </w:r>
+      <w:r>
+        <w:rPr>
+          <w:rFonts w:ascii="Courier New" w:hAnsi="Courier New" w:cs="Courier New"/>
+          <w:sz w:val="20"/>
+          <w:szCs w:val="20"/>
+        </w:rPr>
+        <w:t>Deletes all the .bak files</w:t>
+      </w:r>
+    </w:p>
+    <w:p>
+      <w:pPr>
+        <w:pStyle w:val="NoSpacing"/>
+        <w:ind w:left="2970" w:hanging="2970"/>
+        <w:rPr>
+          <w:rFonts w:ascii="Courier New" w:hAnsi="Courier New" w:cs="Courier New"/>
+          <w:sz w:val="20"/>
+          <w:szCs w:val="20"/>
+        </w:rPr>
+      </w:pPr>
+      <w:r>
+        <w:rPr>
+          <w:rFonts w:ascii="Courier New" w:hAnsi="Courier New" w:cs="Courier New"/>
+          <w:sz w:val="20"/>
+          <w:szCs w:val="20"/>
+        </w:rPr>
+        <w:t>--help</w:t>
+      </w:r>
       <w:r>
         <w:rPr>
           <w:rFonts w:ascii="Courier New" w:hAnsi="Courier New" w:cs="Courier New"/>
@@ -3623,15 +2491,7 @@
     </w:p>
     <w:p>
       <w:r>
-        <w:t xml:space="preserve">An example command line would </w:t>
-      </w:r>
-      <w:proofErr w:type="gramStart"/>
-      <w:r>
-        <w:t>look something</w:t>
-      </w:r>
-      <w:proofErr w:type="gramEnd"/>
-      <w:r>
-        <w:t xml:space="preserve"> like this.</w:t>
+        <w:t>An example command line would look something like this.</w:t>
       </w:r>
     </w:p>
     <w:p>
@@ -3653,90 +2513,8 @@
           <w:sz w:val="18"/>
           <w:szCs w:val="18"/>
         </w:rPr>
-        <w:t>.\localizer.cmd L-Tech --prefix=</w:t>
-      </w:r>
-      <w:proofErr w:type="spellStart"/>
-      <w:r>
-        <w:rPr>
-          <w:rFonts w:ascii="Courier New" w:hAnsi="Courier New" w:cs="Courier New"/>
-          <w:sz w:val="18"/>
-          <w:szCs w:val="18"/>
-        </w:rPr>
-        <w:t>LOC_lTech</w:t>
-      </w:r>
-      <w:proofErr w:type="spellEnd"/>
-      <w:r>
-        <w:rPr>
-          <w:rFonts w:ascii="Courier New" w:hAnsi="Courier New" w:cs="Courier New"/>
-          <w:sz w:val="18"/>
-          <w:szCs w:val="18"/>
-        </w:rPr>
-        <w:t xml:space="preserve"> --</w:t>
-      </w:r>
-      <w:proofErr w:type="spellStart"/>
-      <w:r>
-        <w:rPr>
-          <w:rFonts w:ascii="Courier New" w:hAnsi="Courier New" w:cs="Courier New"/>
-          <w:sz w:val="18"/>
-          <w:szCs w:val="18"/>
-        </w:rPr>
-        <w:t>outdir</w:t>
-      </w:r>
-      <w:proofErr w:type="spellEnd"/>
-      <w:r>
-        <w:rPr>
-          <w:rFonts w:ascii="Courier New" w:hAnsi="Courier New" w:cs="Courier New"/>
-          <w:sz w:val="18"/>
-          <w:szCs w:val="18"/>
-        </w:rPr>
-        <w:t>=L-Tech/</w:t>
-      </w:r>
-      <w:proofErr w:type="spellStart"/>
-      <w:r>
-        <w:rPr>
-          <w:rFonts w:ascii="Courier New" w:hAnsi="Courier New" w:cs="Courier New"/>
-          <w:sz w:val="18"/>
-          <w:szCs w:val="18"/>
-        </w:rPr>
-        <w:t>GameData</w:t>
-      </w:r>
-      <w:proofErr w:type="spellEnd"/>
-      <w:r>
-        <w:rPr>
-          <w:rFonts w:ascii="Courier New" w:hAnsi="Courier New" w:cs="Courier New"/>
-          <w:sz w:val="18"/>
-          <w:szCs w:val="18"/>
-        </w:rPr>
-        <w:t>/</w:t>
-      </w:r>
-      <w:proofErr w:type="spellStart"/>
-      <w:r>
-        <w:rPr>
-          <w:rFonts w:ascii="Courier New" w:hAnsi="Courier New" w:cs="Courier New"/>
-          <w:sz w:val="18"/>
-          <w:szCs w:val="18"/>
-        </w:rPr>
-        <w:t>LTech</w:t>
-      </w:r>
-      <w:proofErr w:type="spellEnd"/>
-      <w:r>
-        <w:rPr>
-          <w:rFonts w:ascii="Courier New" w:hAnsi="Courier New" w:cs="Courier New"/>
-          <w:sz w:val="18"/>
-          <w:szCs w:val="18"/>
-        </w:rPr>
-        <w:t>/Localization --</w:t>
-      </w:r>
-      <w:proofErr w:type="spellStart"/>
-      <w:r>
-        <w:rPr>
-          <w:rFonts w:ascii="Courier New" w:hAnsi="Courier New" w:cs="Courier New"/>
-          <w:sz w:val="18"/>
-          <w:szCs w:val="18"/>
-        </w:rPr>
-        <w:t>numerictags</w:t>
-      </w:r>
-      <w:proofErr w:type="spellEnd"/>
+        <w:t>.\localizer.cmd L-Tech --prefix=LOC_lTech --outdir=L-Tech/GameData/LTech/Localization --numerictags</w:t>
+      </w:r>
     </w:p>
     <w:p>
       <w:r>
@@ -3757,119 +2535,14 @@
           <w:sz w:val="18"/>
           <w:szCs w:val="18"/>
         </w:rPr>
-        <w:t>./localizer.sh L-Tech --prefix=</w:t>
-      </w:r>
-      <w:proofErr w:type="spellStart"/>
-      <w:r>
-        <w:rPr>
-          <w:rFonts w:ascii="Courier New" w:hAnsi="Courier New" w:cs="Courier New"/>
-          <w:sz w:val="18"/>
-          <w:szCs w:val="18"/>
-        </w:rPr>
-        <w:t>LOC_lTech</w:t>
-      </w:r>
-      <w:proofErr w:type="spellEnd"/>
-      <w:r>
-        <w:rPr>
-          <w:rFonts w:ascii="Courier New" w:hAnsi="Courier New" w:cs="Courier New"/>
-          <w:sz w:val="18"/>
-          <w:szCs w:val="18"/>
-        </w:rPr>
-        <w:t xml:space="preserve"> --</w:t>
-      </w:r>
-      <w:proofErr w:type="spellStart"/>
-      <w:r>
-        <w:rPr>
-          <w:rFonts w:ascii="Courier New" w:hAnsi="Courier New" w:cs="Courier New"/>
-          <w:sz w:val="18"/>
-          <w:szCs w:val="18"/>
-        </w:rPr>
-        <w:t>outdir</w:t>
-      </w:r>
-      <w:proofErr w:type="spellEnd"/>
-      <w:r>
-        <w:rPr>
-          <w:rFonts w:ascii="Courier New" w:hAnsi="Courier New" w:cs="Courier New"/>
-          <w:sz w:val="18"/>
-          <w:szCs w:val="18"/>
-        </w:rPr>
-        <w:t>=L-Tech/</w:t>
-      </w:r>
-      <w:proofErr w:type="spellStart"/>
-      <w:r>
-        <w:rPr>
-          <w:rFonts w:ascii="Courier New" w:hAnsi="Courier New" w:cs="Courier New"/>
-          <w:sz w:val="18"/>
-          <w:szCs w:val="18"/>
-        </w:rPr>
-        <w:t>GameData</w:t>
-      </w:r>
-      <w:proofErr w:type="spellEnd"/>
-      <w:r>
-        <w:rPr>
-          <w:rFonts w:ascii="Courier New" w:hAnsi="Courier New" w:cs="Courier New"/>
-          <w:sz w:val="18"/>
-          <w:szCs w:val="18"/>
-        </w:rPr>
-        <w:t>/</w:t>
-      </w:r>
-      <w:proofErr w:type="spellStart"/>
-      <w:r>
-        <w:rPr>
-          <w:rFonts w:ascii="Courier New" w:hAnsi="Courier New" w:cs="Courier New"/>
-          <w:sz w:val="18"/>
-          <w:szCs w:val="18"/>
-        </w:rPr>
-        <w:t>LTech</w:t>
-      </w:r>
-      <w:proofErr w:type="spellEnd"/>
-      <w:r>
-        <w:rPr>
-          <w:rFonts w:ascii="Courier New" w:hAnsi="Courier New" w:cs="Courier New"/>
-          <w:sz w:val="18"/>
-          <w:szCs w:val="18"/>
-        </w:rPr>
-        <w:t>/Localization --</w:t>
-      </w:r>
-      <w:proofErr w:type="spellStart"/>
-      <w:r>
-        <w:rPr>
-          <w:rFonts w:ascii="Courier New" w:hAnsi="Courier New" w:cs="Courier New"/>
-          <w:sz w:val="18"/>
-          <w:szCs w:val="18"/>
-        </w:rPr>
-        <w:t>numerictags</w:t>
-      </w:r>
-      <w:proofErr w:type="spellEnd"/>
+        <w:t>./localizer.sh L-Tech --prefix=LOC_lTech --outdir=L-Tech/GameData/LTech/Localization --numerictags</w:t>
+      </w:r>
     </w:p>
     <w:p/>
     <w:p>
       <w:r>
-        <w:t xml:space="preserve">This is a command to localize a mod called L-Tech.  It is run in the directory above L-Tech.  The prefix to the tags will be </w:t>
-      </w:r>
-      <w:proofErr w:type="spellStart"/>
-      <w:r>
-        <w:t>LOC_lTech</w:t>
-      </w:r>
-      <w:proofErr w:type="spellEnd"/>
-      <w:r>
-        <w:t>, and the output files will be put into the directory L-Tech/</w:t>
-      </w:r>
-      <w:proofErr w:type="spellStart"/>
-      <w:r>
-        <w:t>GameData</w:t>
-      </w:r>
-      <w:proofErr w:type="spellEnd"/>
-      <w:r>
-        <w:t>/</w:t>
-      </w:r>
-      <w:proofErr w:type="spellStart"/>
-      <w:r>
-        <w:t>LTech</w:t>
-      </w:r>
-      <w:proofErr w:type="spellEnd"/>
-      <w:r>
-        <w:t>/Localization</w:t>
+        <w:lastRenderedPageBreak/>
+        <w:t>This is a command to localize a mod called L-Tech.  It is run in the directory above L-Tech.  The prefix to the tags will be LOC_lTech, and the output files will be put into the directory L-Tech/GameData/LTech/Localization</w:t>
       </w:r>
     </w:p>
     <w:p>
@@ -3886,7 +2559,6 @@
         </w:numPr>
       </w:pPr>
       <w:r>
-        <w:lastRenderedPageBreak/>
         <w:t>Scan files</w:t>
       </w:r>
     </w:p>
@@ -3911,15 +2583,7 @@
         </w:numPr>
       </w:pPr>
       <w:r>
-        <w:t>Write modified copies of `.cs` and `.</w:t>
-      </w:r>
-      <w:proofErr w:type="spellStart"/>
-      <w:r>
-        <w:t>cfg</w:t>
-      </w:r>
-      <w:proofErr w:type="spellEnd"/>
-      <w:r>
-        <w:t>` files</w:t>
+        <w:t>Write modified copies of `.cs` and `.cfg` files</w:t>
       </w:r>
     </w:p>
     <w:p>
@@ -3931,15 +2595,7 @@
         </w:numPr>
       </w:pPr>
       <w:r>
-        <w:t>Output `Localization/</w:t>
-      </w:r>
-      <w:proofErr w:type="spellStart"/>
-      <w:r>
-        <w:t>en-us.cfg</w:t>
-      </w:r>
-      <w:proofErr w:type="spellEnd"/>
-      <w:r>
-        <w:t>` and `en-us.csv`</w:t>
+        <w:t>Output `Localization/en-us.cfg` and `en-us.csv`</w:t>
       </w:r>
     </w:p>
     <w:p/>
@@ -3955,26 +2611,10 @@
     </w:p>
     <w:p>
       <w:r>
-        <w:t xml:space="preserve">An </w:t>
-      </w:r>
-      <w:proofErr w:type="spellStart"/>
-      <w:r>
-        <w:t>ini</w:t>
-      </w:r>
-      <w:proofErr w:type="spellEnd"/>
-      <w:r>
-        <w:t xml:space="preserve"> file is included which contains </w:t>
-      </w:r>
-      <w:r>
-        <w:t xml:space="preserve">some optional information which you can use to customize the utility for your mod localizations.  It can </w:t>
-      </w:r>
-      <w:proofErr w:type="gramStart"/>
-      <w:r>
-        <w:t>contains</w:t>
-      </w:r>
-      <w:proofErr w:type="gramEnd"/>
-      <w:r>
-        <w:t xml:space="preserve"> any command-line options which you use all the time, some</w:t>
+        <w:t xml:space="preserve">An ini file is included which contains </w:t>
+      </w:r>
+      <w:r>
+        <w:t>some optional information which you can use to customize the utility for your mod localizations.  It can contains any command-line options which you use all the time, some</w:t>
       </w:r>
       <w:r>
         <w:t xml:space="preserve"> common strings to be ignored</w:t>
@@ -3999,23 +2639,7 @@
     </w:p>
     <w:p>
       <w:r>
-        <w:t xml:space="preserve">The following options which duplicate the command-line options can be included at the top of the </w:t>
-      </w:r>
-      <w:proofErr w:type="spellStart"/>
-      <w:r>
-        <w:t>ini</w:t>
-      </w:r>
-      <w:proofErr w:type="spellEnd"/>
-      <w:r>
-        <w:t xml:space="preserve"> file.  A default value of true is used for those options which are either true or false and don’t have a value. These must appear before any include/</w:t>
-      </w:r>
-      <w:proofErr w:type="gramStart"/>
-      <w:r>
-        <w:t>exclude</w:t>
-      </w:r>
-      <w:proofErr w:type="gramEnd"/>
-      <w:r>
-        <w:t xml:space="preserve"> sections:</w:t>
+        <w:t>The following options which duplicate the command-line options can be included at the top of the ini file.  A default value of true is used for those options which are either true or false and don’t have a value. These must appear before any include/exclude sections:</w:t>
       </w:r>
     </w:p>
     <w:p>
@@ -4028,50 +2652,22 @@
           <w:szCs w:val="20"/>
         </w:rPr>
       </w:pPr>
-      <w:proofErr w:type="spellStart"/>
-      <w:r>
-        <w:rPr>
-          <w:rFonts w:ascii="Courier New" w:hAnsi="Courier New" w:cs="Courier New"/>
-          <w:sz w:val="20"/>
-          <w:szCs w:val="20"/>
-        </w:rPr>
-        <w:t>outdir</w:t>
-      </w:r>
-      <w:proofErr w:type="spellEnd"/>
-      <w:r>
-        <w:rPr>
-          <w:rFonts w:ascii="Courier New" w:hAnsi="Courier New" w:cs="Courier New"/>
-          <w:sz w:val="20"/>
-          <w:szCs w:val="20"/>
-        </w:rPr>
-        <w:t>=&lt;path&gt;</w:t>
-      </w:r>
-      <w:r>
-        <w:rPr>
-          <w:rFonts w:ascii="Courier New" w:hAnsi="Courier New" w:cs="Courier New"/>
-          <w:sz w:val="20"/>
-          <w:szCs w:val="20"/>
-        </w:rPr>
-        <w:tab/>
-        <w:t>Output path for `</w:t>
-      </w:r>
-      <w:proofErr w:type="spellStart"/>
-      <w:r>
-        <w:rPr>
-          <w:rFonts w:ascii="Courier New" w:hAnsi="Courier New" w:cs="Courier New"/>
-          <w:sz w:val="20"/>
-          <w:szCs w:val="20"/>
-        </w:rPr>
-        <w:t>en-us.cfg</w:t>
-      </w:r>
-      <w:proofErr w:type="spellEnd"/>
-      <w:r>
-        <w:rPr>
-          <w:rFonts w:ascii="Courier New" w:hAnsi="Courier New" w:cs="Courier New"/>
-          <w:sz w:val="20"/>
-          <w:szCs w:val="20"/>
-        </w:rPr>
-        <w:t>` and en-us.csv files</w:t>
+      <w:r>
+        <w:rPr>
+          <w:rFonts w:ascii="Courier New" w:hAnsi="Courier New" w:cs="Courier New"/>
+          <w:sz w:val="20"/>
+          <w:szCs w:val="20"/>
+        </w:rPr>
+        <w:t>outdir=&lt;path&gt;</w:t>
+      </w:r>
+      <w:r>
+        <w:rPr>
+          <w:rFonts w:ascii="Courier New" w:hAnsi="Courier New" w:cs="Courier New"/>
+          <w:sz w:val="20"/>
+          <w:szCs w:val="20"/>
+        </w:rPr>
+        <w:tab/>
+        <w:t>Output path for `en-us.cfg` and en-us.csv files</w:t>
       </w:r>
     </w:p>
     <w:p>
@@ -4099,25 +2695,7 @@
           <w:szCs w:val="20"/>
         </w:rPr>
         <w:tab/>
-        <w:t>Localization key prefix (default: `</w:t>
-      </w:r>
-      <w:proofErr w:type="spellStart"/>
-      <w:r>
-        <w:rPr>
-          <w:rFonts w:ascii="Courier New" w:hAnsi="Courier New" w:cs="Courier New"/>
-          <w:sz w:val="20"/>
-          <w:szCs w:val="20"/>
-        </w:rPr>
-        <w:t>MyMod</w:t>
-      </w:r>
-      <w:proofErr w:type="spellEnd"/>
-      <w:r>
-        <w:rPr>
-          <w:rFonts w:ascii="Courier New" w:hAnsi="Courier New" w:cs="Courier New"/>
-          <w:sz w:val="20"/>
-          <w:szCs w:val="20"/>
-        </w:rPr>
-        <w:t xml:space="preserve">_`) </w:t>
+        <w:t xml:space="preserve">Localization key prefix (default: `MyMod_`) </w:t>
       </w:r>
     </w:p>
     <w:p>
@@ -4130,23 +2708,13 @@
           <w:szCs w:val="20"/>
         </w:rPr>
       </w:pPr>
-      <w:proofErr w:type="spellStart"/>
-      <w:r>
-        <w:rPr>
-          <w:rFonts w:ascii="Courier New" w:hAnsi="Courier New" w:cs="Courier New"/>
-          <w:sz w:val="20"/>
-          <w:szCs w:val="20"/>
-        </w:rPr>
-        <w:t>maxkeylength</w:t>
-      </w:r>
-      <w:proofErr w:type="spellEnd"/>
-      <w:r>
-        <w:rPr>
-          <w:rFonts w:ascii="Courier New" w:hAnsi="Courier New" w:cs="Courier New"/>
-          <w:sz w:val="20"/>
-          <w:szCs w:val="20"/>
-        </w:rPr>
-        <w:t>=&lt;number&gt;</w:t>
+      <w:r>
+        <w:rPr>
+          <w:rFonts w:ascii="Courier New" w:hAnsi="Courier New" w:cs="Courier New"/>
+          <w:sz w:val="20"/>
+          <w:szCs w:val="20"/>
+        </w:rPr>
+        <w:t>maxkeylength=&lt;number&gt;</w:t>
       </w:r>
       <w:r>
         <w:rPr>
@@ -4168,7 +2736,6 @@
           <w:szCs w:val="20"/>
         </w:rPr>
       </w:pPr>
-      <w:proofErr w:type="spellStart"/>
       <w:r>
         <w:rPr>
           <w:rFonts w:ascii="Courier New" w:hAnsi="Courier New" w:cs="Courier New"/>
@@ -4177,32 +2744,13 @@
         </w:rPr>
         <w:t>numerictags</w:t>
       </w:r>
-      <w:proofErr w:type="spellEnd"/>
-      <w:r>
-        <w:rPr>
-          <w:rFonts w:ascii="Courier New" w:hAnsi="Courier New" w:cs="Courier New"/>
-          <w:sz w:val="20"/>
-          <w:szCs w:val="20"/>
-        </w:rPr>
-        <w:t>=&lt;</w:t>
-      </w:r>
-      <w:proofErr w:type="spellStart"/>
-      <w:r>
-        <w:rPr>
-          <w:rFonts w:ascii="Courier New" w:hAnsi="Courier New" w:cs="Courier New"/>
-          <w:sz w:val="20"/>
-          <w:szCs w:val="20"/>
-        </w:rPr>
-        <w:t>true|false</w:t>
-      </w:r>
-      <w:proofErr w:type="spellEnd"/>
-      <w:r>
-        <w:rPr>
-          <w:rFonts w:ascii="Courier New" w:hAnsi="Courier New" w:cs="Courier New"/>
-          <w:sz w:val="20"/>
-          <w:szCs w:val="20"/>
-        </w:rPr>
-        <w:t>&gt;</w:t>
+      <w:r>
+        <w:rPr>
+          <w:rFonts w:ascii="Courier New" w:hAnsi="Courier New" w:cs="Courier New"/>
+          <w:sz w:val="20"/>
+          <w:szCs w:val="20"/>
+        </w:rPr>
+        <w:t>=&lt;true|false&gt;</w:t>
       </w:r>
       <w:r>
         <w:rPr>
@@ -4224,7 +2772,6 @@
           <w:szCs w:val="20"/>
         </w:rPr>
       </w:pPr>
-      <w:proofErr w:type="spellStart"/>
       <w:r>
         <w:rPr>
           <w:rFonts w:ascii="Courier New" w:hAnsi="Courier New" w:cs="Courier New"/>
@@ -4233,32 +2780,13 @@
         </w:rPr>
         <w:t>separatePartsCfg</w:t>
       </w:r>
-      <w:proofErr w:type="spellEnd"/>
-      <w:r>
-        <w:rPr>
-          <w:rFonts w:ascii="Courier New" w:hAnsi="Courier New" w:cs="Courier New"/>
-          <w:sz w:val="20"/>
-          <w:szCs w:val="20"/>
-        </w:rPr>
-        <w:t>=&lt;</w:t>
-      </w:r>
-      <w:proofErr w:type="spellStart"/>
-      <w:r>
-        <w:rPr>
-          <w:rFonts w:ascii="Courier New" w:hAnsi="Courier New" w:cs="Courier New"/>
-          <w:sz w:val="20"/>
-          <w:szCs w:val="20"/>
-        </w:rPr>
-        <w:t>true|false</w:t>
-      </w:r>
-      <w:proofErr w:type="spellEnd"/>
-      <w:r>
-        <w:rPr>
-          <w:rFonts w:ascii="Courier New" w:hAnsi="Courier New" w:cs="Courier New"/>
-          <w:sz w:val="20"/>
-          <w:szCs w:val="20"/>
-        </w:rPr>
-        <w:t>&gt;</w:t>
+      <w:r>
+        <w:rPr>
+          <w:rFonts w:ascii="Courier New" w:hAnsi="Courier New" w:cs="Courier New"/>
+          <w:sz w:val="20"/>
+          <w:szCs w:val="20"/>
+        </w:rPr>
+        <w:t>=&lt;true|false&gt;</w:t>
       </w:r>
       <w:r>
         <w:rPr>
@@ -4280,7 +2808,6 @@
           <w:szCs w:val="20"/>
         </w:rPr>
       </w:pPr>
-      <w:proofErr w:type="spellStart"/>
       <w:r>
         <w:rPr>
           <w:rFonts w:ascii="Courier New" w:hAnsi="Courier New" w:cs="Courier New"/>
@@ -4289,32 +2816,13 @@
         </w:rPr>
         <w:t>csonly</w:t>
       </w:r>
-      <w:proofErr w:type="spellEnd"/>
-      <w:r>
-        <w:rPr>
-          <w:rFonts w:ascii="Courier New" w:hAnsi="Courier New" w:cs="Courier New"/>
-          <w:sz w:val="20"/>
-          <w:szCs w:val="20"/>
-        </w:rPr>
-        <w:t>=&lt;</w:t>
-      </w:r>
-      <w:proofErr w:type="spellStart"/>
-      <w:r>
-        <w:rPr>
-          <w:rFonts w:ascii="Courier New" w:hAnsi="Courier New" w:cs="Courier New"/>
-          <w:sz w:val="20"/>
-          <w:szCs w:val="20"/>
-        </w:rPr>
-        <w:t>true|false</w:t>
-      </w:r>
-      <w:proofErr w:type="spellEnd"/>
-      <w:r>
-        <w:rPr>
-          <w:rFonts w:ascii="Courier New" w:hAnsi="Courier New" w:cs="Courier New"/>
-          <w:sz w:val="20"/>
-          <w:szCs w:val="20"/>
-        </w:rPr>
-        <w:t>&gt;</w:t>
+      <w:r>
+        <w:rPr>
+          <w:rFonts w:ascii="Courier New" w:hAnsi="Courier New" w:cs="Courier New"/>
+          <w:sz w:val="20"/>
+          <w:szCs w:val="20"/>
+        </w:rPr>
+        <w:t>=&lt;true|false&gt;</w:t>
       </w:r>
       <w:r>
         <w:rPr>
@@ -4336,7 +2844,6 @@
           <w:szCs w:val="20"/>
         </w:rPr>
       </w:pPr>
-      <w:proofErr w:type="spellStart"/>
       <w:r>
         <w:rPr>
           <w:rFonts w:ascii="Courier New" w:hAnsi="Courier New" w:cs="Courier New"/>
@@ -4345,66 +2852,29 @@
         </w:rPr>
         <w:t>cfgonly</w:t>
       </w:r>
-      <w:proofErr w:type="spellEnd"/>
-      <w:r>
-        <w:rPr>
-          <w:rFonts w:ascii="Courier New" w:hAnsi="Courier New" w:cs="Courier New"/>
-          <w:sz w:val="20"/>
-          <w:szCs w:val="20"/>
-        </w:rPr>
-        <w:t>=&lt;</w:t>
-      </w:r>
-      <w:proofErr w:type="spellStart"/>
-      <w:r>
-        <w:rPr>
-          <w:rFonts w:ascii="Courier New" w:hAnsi="Courier New" w:cs="Courier New"/>
-          <w:sz w:val="20"/>
-          <w:szCs w:val="20"/>
-        </w:rPr>
-        <w:t>true|false</w:t>
-      </w:r>
-      <w:proofErr w:type="spellEnd"/>
-      <w:r>
-        <w:rPr>
-          <w:rFonts w:ascii="Courier New" w:hAnsi="Courier New" w:cs="Courier New"/>
-          <w:sz w:val="20"/>
-          <w:szCs w:val="20"/>
-        </w:rPr>
-        <w:t>&gt;</w:t>
-      </w:r>
-      <w:r>
-        <w:rPr>
-          <w:rFonts w:ascii="Courier New" w:hAnsi="Courier New" w:cs="Courier New"/>
-          <w:sz w:val="20"/>
-          <w:szCs w:val="20"/>
-        </w:rPr>
-        <w:tab/>
-      </w:r>
-      <w:r>
-        <w:rPr>
-          <w:rFonts w:ascii="Courier New" w:hAnsi="Courier New" w:cs="Courier New"/>
-          <w:sz w:val="20"/>
-          <w:szCs w:val="20"/>
-        </w:rPr>
-        <w:t>Only process .</w:t>
-      </w:r>
-      <w:proofErr w:type="spellStart"/>
-      <w:r>
-        <w:rPr>
-          <w:rFonts w:ascii="Courier New" w:hAnsi="Courier New" w:cs="Courier New"/>
-          <w:sz w:val="20"/>
-          <w:szCs w:val="20"/>
-        </w:rPr>
-        <w:t>cfg</w:t>
-      </w:r>
-      <w:proofErr w:type="spellEnd"/>
-      <w:r>
-        <w:rPr>
-          <w:rFonts w:ascii="Courier New" w:hAnsi="Courier New" w:cs="Courier New"/>
-          <w:sz w:val="20"/>
-          <w:szCs w:val="20"/>
-        </w:rPr>
-        <w:t xml:space="preserve"> files</w:t>
+      <w:r>
+        <w:rPr>
+          <w:rFonts w:ascii="Courier New" w:hAnsi="Courier New" w:cs="Courier New"/>
+          <w:sz w:val="20"/>
+          <w:szCs w:val="20"/>
+        </w:rPr>
+        <w:t>=&lt;true|false&gt;</w:t>
+      </w:r>
+      <w:r>
+        <w:rPr>
+          <w:rFonts w:ascii="Courier New" w:hAnsi="Courier New" w:cs="Courier New"/>
+          <w:sz w:val="20"/>
+          <w:szCs w:val="20"/>
+        </w:rPr>
+        <w:tab/>
+      </w:r>
+      <w:r>
+        <w:rPr>
+          <w:rFonts w:ascii="Courier New" w:hAnsi="Courier New" w:cs="Courier New"/>
+          <w:sz w:val="20"/>
+          <w:szCs w:val="20"/>
+        </w:rPr>
+        <w:t>Only process .cfg files</w:t>
       </w:r>
     </w:p>
     <w:p>
@@ -4420,6 +2890,45 @@
     </w:p>
     <w:p>
       <w:pPr>
+        <w:pStyle w:val="NoSpacing"/>
+        <w:ind w:left="3690" w:hanging="3690"/>
+        <w:rPr>
+          <w:rFonts w:ascii="Courier New" w:hAnsi="Courier New" w:cs="Courier New"/>
+          <w:sz w:val="20"/>
+          <w:szCs w:val="20"/>
+        </w:rPr>
+      </w:pPr>
+      <w:r>
+        <w:rPr>
+          <w:rFonts w:ascii="Courier New" w:hAnsi="Courier New" w:cs="Courier New"/>
+          <w:sz w:val="20"/>
+          <w:szCs w:val="20"/>
+        </w:rPr>
+        <w:t>dir=&lt;dir&gt;</w:t>
+      </w:r>
+      <w:r>
+        <w:rPr>
+          <w:rFonts w:ascii="Courier New" w:hAnsi="Courier New" w:cs="Courier New"/>
+          <w:sz w:val="20"/>
+          <w:szCs w:val="20"/>
+        </w:rPr>
+        <w:tab/>
+        <w:t>Specifies a directory to exclude, only valid in [exclude] section</w:t>
+      </w:r>
+    </w:p>
+    <w:p>
+      <w:pPr>
+        <w:pStyle w:val="NoSpacing"/>
+        <w:ind w:left="3690" w:hanging="3690"/>
+        <w:rPr>
+          <w:rFonts w:ascii="Courier New" w:hAnsi="Courier New" w:cs="Courier New"/>
+          <w:sz w:val="20"/>
+          <w:szCs w:val="20"/>
+        </w:rPr>
+      </w:pPr>
+    </w:p>
+    <w:p>
+      <w:pPr>
         <w:pStyle w:val="Heading4"/>
       </w:pPr>
       <w:r>
@@ -4437,26 +2946,10 @@
         <w:t xml:space="preserve">of the file.  </w:t>
       </w:r>
       <w:r>
-        <w:t xml:space="preserve">Multiple </w:t>
-      </w:r>
-      <w:proofErr w:type="spellStart"/>
-      <w:r>
-        <w:t>ini</w:t>
-      </w:r>
-      <w:proofErr w:type="spellEnd"/>
-      <w:r>
-        <w:t xml:space="preserve"> files can be used </w:t>
-      </w:r>
-      <w:r>
-        <w:t>by specifying the --</w:t>
-      </w:r>
-      <w:proofErr w:type="spellStart"/>
-      <w:r>
-        <w:t>inifile</w:t>
-      </w:r>
-      <w:proofErr w:type="spellEnd"/>
-      <w:r>
-        <w:t>=&lt;file&gt; to use your</w:t>
+        <w:t xml:space="preserve">Multiple ini files can be used </w:t>
+      </w:r>
+      <w:r>
+        <w:t>by specifying the --inifile=&lt;file&gt; to use your</w:t>
       </w:r>
       <w:r>
         <w:t xml:space="preserve"> </w:t>
@@ -4468,47 +2961,22 @@
         <w:t>n file in addition to the stock one.</w:t>
       </w:r>
       <w:r>
-        <w:t xml:space="preserve">  Multiple </w:t>
-      </w:r>
-      <w:proofErr w:type="spellStart"/>
-      <w:r>
-        <w:t>ini</w:t>
-      </w:r>
-      <w:proofErr w:type="spellEnd"/>
-      <w:r>
-        <w:t xml:space="preserve"> files are allowed, the entries are additive.  </w:t>
-      </w:r>
-    </w:p>
-    <w:p>
-      <w:r>
-        <w:t xml:space="preserve">Review the supplied </w:t>
-      </w:r>
-      <w:proofErr w:type="spellStart"/>
-      <w:r>
-        <w:t>ini</w:t>
-      </w:r>
-      <w:proofErr w:type="spellEnd"/>
-      <w:r>
-        <w:t xml:space="preserve"> file to understand what might be excluded.  For example, “const string” is excluded since string constants </w:t>
-      </w:r>
-      <w:proofErr w:type="gramStart"/>
-      <w:r>
-        <w:t>have to</w:t>
-      </w:r>
-      <w:proofErr w:type="gramEnd"/>
-      <w:r>
-        <w:t xml:space="preserve"> be literal. </w:t>
+        <w:t xml:space="preserve">  Multiple ini files are allowed, the entries are additive.  </w:t>
+      </w:r>
+    </w:p>
+    <w:p>
+      <w:r>
+        <w:t xml:space="preserve">Review the supplied ini file to understand what might be excluded.  For example, “const string” is excluded since string constants have to be literal. </w:t>
       </w:r>
     </w:p>
     <w:p>
       <w:pPr>
         <w:pStyle w:val="Heading4"/>
       </w:pPr>
-      <w:proofErr w:type="spellStart"/>
-      <w:r>
+      <w:r>
+        <w:lastRenderedPageBreak/>
         <w:t>experimentPlanets</w:t>
       </w:r>
-      <w:proofErr w:type="spellEnd"/>
     </w:p>
     <w:p>
       <w:r>
@@ -4521,115 +2989,210 @@
       </w:pPr>
       <w:bookmarkStart w:id="7" w:name="_Toc200005798"/>
       <w:r>
+        <w:t>Reverts and cleanup</w:t>
+      </w:r>
+      <w:bookmarkEnd w:id="7"/>
+    </w:p>
+    <w:p>
+      <w:r>
+        <w:t>These two options override all others.  In other words, if either of them is on the command line in addition to any other options, the revert/cleanbak functions will be run instead</w:t>
+      </w:r>
+      <w:r>
+        <w:t>.</w:t>
+      </w:r>
+    </w:p>
+    <w:p/>
+    <w:p>
+      <w:pPr>
+        <w:pStyle w:val="Heading2"/>
+      </w:pPr>
+      <w:bookmarkStart w:id="8" w:name="_Toc200005799"/>
+      <w:r>
+        <w:t>Note</w:t>
+      </w:r>
+      <w:r>
+        <w:t>s</w:t>
+      </w:r>
+      <w:bookmarkEnd w:id="8"/>
+    </w:p>
+    <w:p>
+      <w:r>
+        <w:t>(in no particular order)</w:t>
+      </w:r>
+    </w:p>
+    <w:p>
+      <w:pPr>
+        <w:pStyle w:val="ListParagraph"/>
+        <w:numPr>
+          <w:ilvl w:val="0"/>
+          <w:numId w:val="4"/>
+        </w:numPr>
+      </w:pPr>
+      <w:r>
+        <w:t>While pre-existing localized tags are not treated as strings, there is no mechanism to check for duplicates with any pre-existing tags.  If the mod does have some pre-existing tags, the</w:t>
+      </w:r>
+      <w:r>
+        <w:t xml:space="preserve"> </w:t>
+      </w:r>
+      <w:r>
+        <w:t>safest thing to do is just use a different prefix.</w:t>
+      </w:r>
+    </w:p>
+    <w:p>
+      <w:pPr>
+        <w:pStyle w:val="ListParagraph"/>
+        <w:numPr>
+          <w:ilvl w:val="0"/>
+          <w:numId w:val="4"/>
+        </w:numPr>
+      </w:pPr>
+      <w:r>
+        <w:t>Complex strings with embedded format values may not be converted correctly.  For example:</w:t>
+      </w:r>
+    </w:p>
+    <w:p>
+      <w:pPr>
+        <w:ind w:left="720"/>
+      </w:pPr>
+      <w:r>
+        <w:t>These two strings show one possibility.  The first string is the original, with the format somewhere in the middle of the string.  The second one shows how you can fix this</w:t>
+      </w:r>
+    </w:p>
+    <w:p>
+      <w:pPr>
+        <w:ind w:left="720"/>
+        <w:rPr>
+          <w:rFonts w:ascii="Courier New" w:hAnsi="Courier New" w:cs="Courier New"/>
+          <w:sz w:val="20"/>
+          <w:szCs w:val="20"/>
+        </w:rPr>
+      </w:pPr>
+      <w:r>
+        <w:rPr>
+          <w:rFonts w:ascii="Courier New" w:hAnsi="Courier New" w:cs="Courier New"/>
+          <w:sz w:val="20"/>
+          <w:szCs w:val="20"/>
+        </w:rPr>
+        <w:t>GUILayout.Label($"vY: {y:f2}", Styles.RedLabel13);</w:t>
+      </w:r>
+    </w:p>
+    <w:p>
+      <w:pPr>
+        <w:ind w:left="720"/>
+        <w:rPr>
+          <w:rFonts w:ascii="Courier New" w:hAnsi="Courier New" w:cs="Courier New"/>
+          <w:sz w:val="20"/>
+          <w:szCs w:val="20"/>
+        </w:rPr>
+      </w:pPr>
+      <w:r>
+        <w:rPr>
+          <w:rFonts w:ascii="Courier New" w:hAnsi="Courier New" w:cs="Courier New"/>
+          <w:sz w:val="20"/>
+          <w:szCs w:val="20"/>
+        </w:rPr>
+        <w:t>GUILayout.Label("vY: " + $"{y:f2}", Styles.RedLabel13);</w:t>
+      </w:r>
+    </w:p>
+    <w:p>
+      <w:pPr>
+        <w:ind w:left="720"/>
+      </w:pPr>
+      <w:r>
+        <w:t>And the result of the conversion:</w:t>
+      </w:r>
+    </w:p>
+    <w:p>
+      <w:pPr>
+        <w:ind w:left="720"/>
+        <w:rPr>
+          <w:rFonts w:ascii="Courier New" w:hAnsi="Courier New" w:cs="Courier New"/>
+          <w:sz w:val="20"/>
+          <w:szCs w:val="20"/>
+        </w:rPr>
+      </w:pPr>
+      <w:r>
+        <w:rPr>
+          <w:rFonts w:ascii="Courier New" w:hAnsi="Courier New" w:cs="Courier New"/>
+          <w:sz w:val="20"/>
+          <w:szCs w:val="20"/>
+        </w:rPr>
+        <w:t>GUILayout.Label(Localizer.Format("#LOC_DockingCam_35") + $"{y}" + "f2" + "}", Styles.RedLabel13);</w:t>
+      </w:r>
+    </w:p>
+    <w:p>
+      <w:pPr>
+        <w:ind w:left="720"/>
+        <w:rPr>
+          <w:rFonts w:ascii="Courier New" w:hAnsi="Courier New" w:cs="Courier New"/>
+          <w:sz w:val="20"/>
+          <w:szCs w:val="20"/>
+        </w:rPr>
+      </w:pPr>
+      <w:r>
+        <w:rPr>
+          <w:rFonts w:ascii="Courier New" w:hAnsi="Courier New" w:cs="Courier New"/>
+          <w:sz w:val="20"/>
+          <w:szCs w:val="20"/>
+        </w:rPr>
+        <w:t>GUILayout.Label($ "vY:" + " {y}" + "f2" + "}", Styles.RedLabel13);</w:t>
+      </w:r>
+    </w:p>
+    <w:p/>
+    <w:p>
+      <w:pPr>
+        <w:pStyle w:val="ListParagraph"/>
+        <w:numPr>
+          <w:ilvl w:val="0"/>
+          <w:numId w:val="4"/>
+        </w:numPr>
+      </w:pPr>
+      <w:r>
+        <w:t>Another quirk is the way KSP deals with Event strings.  While normally code needs to call Localizer.Format</w:t>
+      </w:r>
+      <w:r>
+        <w:t xml:space="preserve"> </w:t>
+      </w:r>
+      <w:r>
+        <w:t xml:space="preserve">to get the localized string, there is no need to do this for events since the event code itself will be calling the localizer.  It's almost impossible to detect this, so this edge case is not dealt with.  </w:t>
+      </w:r>
+    </w:p>
+    <w:p>
+      <w:pPr>
+        <w:ind w:left="720"/>
+      </w:pPr>
+      <w:r>
+        <w:t>Other than a tiny bit of performance loss due to the double call of Localizer.Format, there should be no change in functionality.</w:t>
+      </w:r>
+    </w:p>
+    <w:p>
+      <w:pPr>
+        <w:ind w:left="720"/>
+      </w:pPr>
+      <w:r>
+        <w:t>This is something the user will need to look at during the conversion process</w:t>
+      </w:r>
+      <w:r>
+        <w:t>.</w:t>
+      </w:r>
+    </w:p>
+    <w:p>
+      <w:pPr>
+        <w:pStyle w:val="ListParagraph"/>
+        <w:numPr>
+          <w:ilvl w:val="0"/>
+          <w:numId w:val="4"/>
+        </w:numPr>
+      </w:pPr>
+      <w:r>
         <w:lastRenderedPageBreak/>
-        <w:t>Reverts and cleanup</w:t>
-      </w:r>
-      <w:bookmarkEnd w:id="7"/>
-    </w:p>
-    <w:p>
-      <w:r>
-        <w:t>These two options override all others.  In other words, if either of them is on the command line in addition to any other options, the revert/</w:t>
-      </w:r>
-      <w:proofErr w:type="spellStart"/>
-      <w:r>
-        <w:t>cleanbak</w:t>
-      </w:r>
-      <w:proofErr w:type="spellEnd"/>
-      <w:r>
-        <w:t xml:space="preserve"> functions will be run instead</w:t>
-      </w:r>
-      <w:r>
-        <w:t>.</w:t>
-      </w:r>
-    </w:p>
-    <w:p/>
-    <w:p>
-      <w:pPr>
-        <w:pStyle w:val="Heading2"/>
-      </w:pPr>
-      <w:bookmarkStart w:id="8" w:name="_Toc200005799"/>
-      <w:r>
-        <w:t>Note</w:t>
-      </w:r>
-      <w:r>
-        <w:t>s</w:t>
-      </w:r>
-      <w:bookmarkEnd w:id="8"/>
-    </w:p>
-    <w:p/>
-    <w:p>
-      <w:r>
-        <w:t>While pre-existing localized tags are not treated as strings, there is no mechanism to check for duplicates with any pre-existing tags.  If the mod does have some pre-existing tags, the</w:t>
-      </w:r>
-      <w:r>
-        <w:t xml:space="preserve"> </w:t>
-      </w:r>
-      <w:r>
-        <w:t>safest thing to do is just use a different prefix.</w:t>
-      </w:r>
-    </w:p>
-    <w:p>
-      <w:r>
-        <w:t>Pre-existing localization files may be overwritten if the names are the same</w:t>
-      </w:r>
-      <w:r>
-        <w:t>.</w:t>
-      </w:r>
-    </w:p>
-    <w:p>
-      <w:r>
-        <w:t xml:space="preserve">Another quirk is the way KSP deals with Event strings.  While normally code needs to call </w:t>
-      </w:r>
-      <w:proofErr w:type="spellStart"/>
-      <w:r>
-        <w:t>Localizer</w:t>
-      </w:r>
-      <w:proofErr w:type="gramStart"/>
-      <w:r>
-        <w:t>.Format</w:t>
-      </w:r>
-      <w:proofErr w:type="spellEnd"/>
-      <w:proofErr w:type="gramEnd"/>
-      <w:r>
-        <w:t xml:space="preserve"> </w:t>
-      </w:r>
-      <w:r>
-        <w:t xml:space="preserve">to get the localized string, there is no need to do this for events since the event code itself will be calling the localizer.  It's almost impossible to detect this, so this edge case is not dealt with.  </w:t>
-      </w:r>
-    </w:p>
-    <w:p>
-      <w:r>
-        <w:t xml:space="preserve">Other than a tiny bit of performance loss due to the double call of </w:t>
-      </w:r>
-      <w:proofErr w:type="spellStart"/>
-      <w:r>
-        <w:t>Localizer.Format</w:t>
-      </w:r>
-      <w:proofErr w:type="spellEnd"/>
-      <w:r>
-        <w:t>, there should be no change in functionality.</w:t>
-      </w:r>
-    </w:p>
-    <w:p>
-      <w:r>
-        <w:t>This is something the user will need to look at during the conversion process</w:t>
-      </w:r>
-      <w:r>
-        <w:t>.</w:t>
-      </w:r>
-    </w:p>
-    <w:p>
-      <w:r>
-        <w:t xml:space="preserve">When running this on a C-Sharp code-based </w:t>
-      </w:r>
-      <w:proofErr w:type="gramStart"/>
-      <w:r>
-        <w:t>mod</w:t>
-      </w:r>
-      <w:proofErr w:type="gramEnd"/>
-      <w:r>
-        <w:t>, there is no way to determine if a string is meant for internal use or not.  This is where the --revert option and the NO_LOCALIZATION region_ comes in handy.  Simply add the --revert to the existing line and run to undo all the changes.  There are two tools available to fix this:</w:t>
-      </w:r>
+        <w:t>When running this on a C-Sharp code-based mod, there is no way to determine if a string is meant for internal use or not.  This is where the --revert option and the NO_LOCALIZATION region_ comes in handy.  Simply add the --revert to the existing line and run to undo all the changes.  There are two tools available to fix this:</w:t>
+      </w:r>
+    </w:p>
+    <w:p>
+      <w:pPr>
+        <w:pStyle w:val="ListParagraph"/>
+      </w:pPr>
     </w:p>
     <w:p>
       <w:pPr>
@@ -4638,6 +3201,7 @@
           <w:ilvl w:val="0"/>
           <w:numId w:val="3"/>
         </w:numPr>
+        <w:ind w:left="1080"/>
       </w:pPr>
       <w:r>
         <w:t xml:space="preserve">Use the </w:t>
@@ -4683,23 +3247,61 @@
         </w:rPr>
         <w:t xml:space="preserve"> </w:t>
       </w:r>
+    </w:p>
+    <w:p>
+      <w:pPr>
+        <w:pStyle w:val="ListParagraph"/>
+        <w:ind w:left="1080"/>
+      </w:pPr>
+      <w:r>
+        <w:rPr>
+          <w:rFonts w:ascii="Courier New" w:hAnsi="Courier New" w:cs="Courier New"/>
+        </w:rPr>
+        <w:br/>
+      </w:r>
+      <w:r>
+        <w:t>to mark sections of code which should not be localized</w:t>
+      </w:r>
+      <w:r>
+        <w:t>.  Be aware that nested regions are not supported</w:t>
+      </w:r>
+    </w:p>
+    <w:p>
+      <w:pPr>
+        <w:pStyle w:val="ListParagraph"/>
+        <w:ind w:left="1080"/>
+      </w:pPr>
     </w:p>
     <w:p>
       <w:pPr>
         <w:pStyle w:val="ListParagraph"/>
         <w:numPr>
           <w:ilvl w:val="0"/>
-          <w:numId w:val="3"/>
+          <w:numId w:val="5"/>
         </w:numPr>
       </w:pPr>
       <w:r>
-        <w:rPr>
-          <w:rFonts w:ascii="Courier New" w:hAnsi="Courier New" w:cs="Courier New"/>
-        </w:rPr>
+        <w:t>Another way to avoid localizing a single line is to put a comment at the end of the line which says NO_LOCALIZATION as follows in this line from a mod:</w:t>
+      </w:r>
+      <w:r>
         <w:br/>
       </w:r>
-      <w:r>
-        <w:t>to mark sections of code which should not be localized</w:t>
+    </w:p>
+    <w:p>
+      <w:pPr>
+        <w:pStyle w:val="ListParagraph"/>
+        <w:ind w:left="1080"/>
+      </w:pPr>
+      <w:r>
+        <w:rPr>
+          <w:rFonts w:ascii="Courier New" w:hAnsi="Courier New" w:cs="Courier New"/>
+          <w:sz w:val="20"/>
+          <w:szCs w:val="20"/>
+        </w:rPr>
+        <w:t>serverListener.Prefixes.Add("http://localhost:2551/"); // NO_LOCALIZATION</w:t>
+      </w:r>
+      <w:r>
+        <w:br/>
       </w:r>
     </w:p>
     <w:p>
@@ -4707,7 +3309,7 @@
         <w:pStyle w:val="ListParagraph"/>
         <w:numPr>
           <w:ilvl w:val="0"/>
-          <w:numId w:val="3"/>
+          <w:numId w:val="5"/>
         </w:numPr>
       </w:pPr>
       <w:r>
@@ -4741,6 +3343,7 @@
     <w:p>
       <w:pPr>
         <w:pStyle w:val="ListParagraph"/>
+        <w:ind w:left="360"/>
       </w:pPr>
     </w:p>
     <w:p>
@@ -4750,6 +3353,7 @@
         <w:autoSpaceDN w:val="0"/>
         <w:adjustRightInd w:val="0"/>
         <w:spacing w:after="0" w:line="240" w:lineRule="auto"/>
+        <w:ind w:left="360"/>
         <w:rPr>
           <w:rFonts w:ascii="Courier New" w:hAnsi="Courier New" w:cs="Courier New"/>
           <w:color w:val="000000"/>
@@ -4778,6 +3382,7 @@
         <w:autoSpaceDN w:val="0"/>
         <w:adjustRightInd w:val="0"/>
         <w:spacing w:after="0" w:line="240" w:lineRule="auto"/>
+        <w:ind w:left="360"/>
         <w:rPr>
           <w:rFonts w:ascii="Courier New" w:hAnsi="Courier New" w:cs="Courier New"/>
           <w:color w:val="000000"/>
@@ -4806,6 +3411,7 @@
         <w:autoSpaceDN w:val="0"/>
         <w:adjustRightInd w:val="0"/>
         <w:spacing w:after="0" w:line="240" w:lineRule="auto"/>
+        <w:ind w:left="360"/>
         <w:rPr>
           <w:rFonts w:ascii="Courier New" w:hAnsi="Courier New" w:cs="Courier New"/>
           <w:color w:val="000000"/>
@@ -4823,7 +3429,6 @@
           <w:szCs w:val="20"/>
           <w:highlight w:val="white"/>
         </w:rPr>
-        <w:lastRenderedPageBreak/>
         <w:t>#endregion</w:t>
       </w:r>
     </w:p>
@@ -4834,6 +3439,7 @@
         <w:autoSpaceDN w:val="0"/>
         <w:adjustRightInd w:val="0"/>
         <w:spacing w:after="0" w:line="240" w:lineRule="auto"/>
+        <w:ind w:left="360"/>
         <w:rPr>
           <w:rFonts w:ascii="Cascadia Mono" w:hAnsi="Cascadia Mono" w:cs="Cascadia Mono"/>
           <w:color w:val="000000"/>
@@ -4848,7 +3454,7 @@
         <w:pStyle w:val="ListParagraph"/>
         <w:numPr>
           <w:ilvl w:val="0"/>
-          <w:numId w:val="3"/>
+          <w:numId w:val="5"/>
         </w:numPr>
         <w:autoSpaceDE w:val="0"/>
         <w:autoSpaceDN w:val="0"/>
@@ -4864,15 +3470,7 @@
         </w:rPr>
       </w:pPr>
       <w:r>
-        <w:t xml:space="preserve">Create a new </w:t>
-      </w:r>
-      <w:proofErr w:type="spellStart"/>
-      <w:r>
-        <w:t>ini</w:t>
-      </w:r>
-      <w:proofErr w:type="spellEnd"/>
-      <w:r>
-        <w:t xml:space="preserve"> file with your desired entries, then</w:t>
+        <w:t>Create a new ini file with your desired entries, then</w:t>
       </w:r>
       <w:r>
         <w:t>, u</w:t>
@@ -4941,6 +3539,95 @@
 <file path=word/numbering.xml><?xml version="1.0" encoding="utf-8"?>
 <w:numbering xmlns:wpc="http://schemas.microsoft.com/office/word/2010/wordprocessingCanvas" xmlns:cx="http://schemas.microsoft.com/office/drawing/2014/chartex" xmlns:cx1="http://schemas.microsoft.com/office/drawing/2015/9/8/chartex" xmlns:cx2="http://schemas.microsoft.com/office/drawing/2015/10/21/chartex" xmlns:cx3="http://schemas.microsoft.com/office/drawing/2016/5/9/chartex" xmlns:cx4="http://schemas.microsoft.com/office/drawing/2016/5/10/chartex" xmlns:cx5="http://schemas.microsoft.com/office/drawing/2016/5/11/chartex" xmlns:cx6="http://schemas.microsoft.com/office/drawing/2016/5/12/chartex" xmlns:cx7="http://schemas.microsoft.com/office/drawing/2016/5/13/chartex" xmlns:cx8="http://schemas.microsoft.com/office/drawing/2016/5/14/chartex" xmlns:mc="http://schemas.openxmlformats.org/markup-compatibility/2006" xmlns:aink="http://schemas.microsoft.com/office/drawing/2016/ink" xmlns:am3d="http://schemas.microsoft.com/office/drawing/2017/model3d" xmlns:o="urn:schemas-microsoft-com:office:office" xmlns:oel="http://schemas.microsoft.com/office/2019/extlst" xmlns:r="http://schemas.openxmlformats.org/officeDocument/2006/relationships" xmlns:m="http://schemas.openxmlformats.org/officeDocument/2006/math" xmlns:v="urn:schemas-microsoft-com:vml" xmlns:wp14="http://schemas.microsoft.com/office/word/2010/wordprocessingDrawing" xmlns:wp="http://schemas.openxmlformats.org/drawingml/2006/wordprocessingDrawing" xmlns:w10="urn:schemas-microsoft-com:office:word" xmlns:w="http://schemas.openxmlformats.org/wordprocessingml/2006/main" xmlns:w14="http://schemas.microsoft.com/office/word/2010/wordml" xmlns:w15="http://schemas.microsoft.com/office/word/2012/wordml" xmlns:w16cex="http://schemas.microsoft.com/office/word/2018/wordml/cex" xmlns:w16cid="http://schemas.microsoft.com/office/word/2016/wordml/cid" xmlns:w16="http://schemas.microsoft.com/office/word/2018/wordml" xmlns:w16du="http://schemas.microsoft.com/office/word/2023/wordml/word16du" xmlns:w16sdtdh="http://schemas.microsoft.com/office/word/2020/wordml/sdtdatahash" xmlns:w16sdtfl="http://schemas.microsoft.com/office/word/2024/wordml/sdtformatlock" xmlns:w16se="http://schemas.microsoft.com/office/word/2015/wordml/symex" xmlns:wpg="http://schemas.microsoft.com/office/word/2010/wordprocessingGroup" xmlns:wpi="http://schemas.microsoft.com/office/word/2010/wordprocessingInk" xmlns:wne="http://schemas.microsoft.com/office/word/2006/wordml" xmlns:wps="http://schemas.microsoft.com/office/word/2010/wordprocessingShape" mc:Ignorable="w14 w15 w16se w16cid w16 w16cex w16sdtdh w16sdtfl w16du wp14">
   <w:abstractNum w:abstractNumId="0" w15:restartNumberingAfterBreak="0">
+    <w:nsid w:val="1A875966"/>
+    <w:multiLevelType w:val="hybridMultilevel"/>
+    <w:tmpl w:val="522AA190"/>
+    <w:lvl w:ilvl="0" w:tplc="0409000F">
+      <w:start w:val="3"/>
+      <w:numFmt w:val="decimal"/>
+      <w:lvlText w:val="%1."/>
+      <w:lvlJc w:val="left"/>
+      <w:pPr>
+        <w:ind w:left="360" w:hanging="360"/>
+      </w:pPr>
+      <w:rPr>
+        <w:rFonts w:hint="default"/>
+      </w:rPr>
+    </w:lvl>
+    <w:lvl w:ilvl="1" w:tplc="04090019">
+      <w:start w:val="1"/>
+      <w:numFmt w:val="lowerLetter"/>
+      <w:lvlText w:val="%2."/>
+      <w:lvlJc w:val="left"/>
+      <w:pPr>
+        <w:ind w:left="1080" w:hanging="360"/>
+      </w:pPr>
+    </w:lvl>
+    <w:lvl w:ilvl="2" w:tplc="0409001B" w:tentative="1">
+      <w:start w:val="1"/>
+      <w:numFmt w:val="lowerRoman"/>
+      <w:lvlText w:val="%3."/>
+      <w:lvlJc w:val="right"/>
+      <w:pPr>
+        <w:ind w:left="1800" w:hanging="180"/>
+      </w:pPr>
+    </w:lvl>
+    <w:lvl w:ilvl="3" w:tplc="0409000F" w:tentative="1">
+      <w:start w:val="1"/>
+      <w:numFmt w:val="decimal"/>
+      <w:lvlText w:val="%4."/>
+      <w:lvlJc w:val="left"/>
+      <w:pPr>
+        <w:ind w:left="2520" w:hanging="360"/>
+      </w:pPr>
+    </w:lvl>
+    <w:lvl w:ilvl="4" w:tplc="04090019" w:tentative="1">
+      <w:start w:val="1"/>
+      <w:numFmt w:val="lowerLetter"/>
+      <w:lvlText w:val="%5."/>
+      <w:lvlJc w:val="left"/>
+      <w:pPr>
+        <w:ind w:left="3240" w:hanging="360"/>
+      </w:pPr>
+    </w:lvl>
+    <w:lvl w:ilvl="5" w:tplc="0409001B" w:tentative="1">
+      <w:start w:val="1"/>
+      <w:numFmt w:val="lowerRoman"/>
+      <w:lvlText w:val="%6."/>
+      <w:lvlJc w:val="right"/>
+      <w:pPr>
+        <w:ind w:left="3960" w:hanging="180"/>
+      </w:pPr>
+    </w:lvl>
+    <w:lvl w:ilvl="6" w:tplc="0409000F" w:tentative="1">
+      <w:start w:val="1"/>
+      <w:numFmt w:val="decimal"/>
+      <w:lvlText w:val="%7."/>
+      <w:lvlJc w:val="left"/>
+      <w:pPr>
+        <w:ind w:left="4680" w:hanging="360"/>
+      </w:pPr>
+    </w:lvl>
+    <w:lvl w:ilvl="7" w:tplc="04090019" w:tentative="1">
+      <w:start w:val="1"/>
+      <w:numFmt w:val="lowerLetter"/>
+      <w:lvlText w:val="%8."/>
+      <w:lvlJc w:val="left"/>
+      <w:pPr>
+        <w:ind w:left="5400" w:hanging="360"/>
+      </w:pPr>
+    </w:lvl>
+    <w:lvl w:ilvl="8" w:tplc="0409001B" w:tentative="1">
+      <w:start w:val="1"/>
+      <w:numFmt w:val="lowerRoman"/>
+      <w:lvlText w:val="%9."/>
+      <w:lvlJc w:val="right"/>
+      <w:pPr>
+        <w:ind w:left="6120" w:hanging="180"/>
+      </w:pPr>
+    </w:lvl>
+  </w:abstractNum>
+  <w:abstractNum w:abstractNumId="1" w15:restartNumberingAfterBreak="0">
     <w:nsid w:val="1BEE39FF"/>
     <w:multiLevelType w:val="hybridMultilevel"/>
     <w:tmpl w:val="85CC60D2"/>
@@ -5029,7 +3716,7 @@
       </w:pPr>
     </w:lvl>
   </w:abstractNum>
-  <w:abstractNum w:abstractNumId="1" w15:restartNumberingAfterBreak="0">
+  <w:abstractNum w:abstractNumId="2" w15:restartNumberingAfterBreak="0">
     <w:nsid w:val="3F9623F7"/>
     <w:multiLevelType w:val="hybridMultilevel"/>
     <w:tmpl w:val="CFA20944"/>
@@ -5141,7 +3828,96 @@
       </w:rPr>
     </w:lvl>
   </w:abstractNum>
-  <w:abstractNum w:abstractNumId="2" w15:restartNumberingAfterBreak="0">
+  <w:abstractNum w:abstractNumId="3" w15:restartNumberingAfterBreak="0">
+    <w:nsid w:val="62983295"/>
+    <w:multiLevelType w:val="hybridMultilevel"/>
+    <w:tmpl w:val="5E9626FE"/>
+    <w:lvl w:ilvl="0" w:tplc="0409000F">
+      <w:start w:val="1"/>
+      <w:numFmt w:val="decimal"/>
+      <w:lvlText w:val="%1."/>
+      <w:lvlJc w:val="left"/>
+      <w:pPr>
+        <w:ind w:left="720" w:hanging="360"/>
+      </w:pPr>
+      <w:rPr>
+        <w:rFonts w:hint="default"/>
+      </w:rPr>
+    </w:lvl>
+    <w:lvl w:ilvl="1" w:tplc="04090019" w:tentative="1">
+      <w:start w:val="1"/>
+      <w:numFmt w:val="lowerLetter"/>
+      <w:lvlText w:val="%2."/>
+      <w:lvlJc w:val="left"/>
+      <w:pPr>
+        <w:ind w:left="1440" w:hanging="360"/>
+      </w:pPr>
+    </w:lvl>
+    <w:lvl w:ilvl="2" w:tplc="0409001B" w:tentative="1">
+      <w:start w:val="1"/>
+      <w:numFmt w:val="lowerRoman"/>
+      <w:lvlText w:val="%3."/>
+      <w:lvlJc w:val="right"/>
+      <w:pPr>
+        <w:ind w:left="2160" w:hanging="180"/>
+      </w:pPr>
+    </w:lvl>
+    <w:lvl w:ilvl="3" w:tplc="0409000F" w:tentative="1">
+      <w:start w:val="1"/>
+      <w:numFmt w:val="decimal"/>
+      <w:lvlText w:val="%4."/>
+      <w:lvlJc w:val="left"/>
+      <w:pPr>
+        <w:ind w:left="2880" w:hanging="360"/>
+      </w:pPr>
+    </w:lvl>
+    <w:lvl w:ilvl="4" w:tplc="04090019" w:tentative="1">
+      <w:start w:val="1"/>
+      <w:numFmt w:val="lowerLetter"/>
+      <w:lvlText w:val="%5."/>
+      <w:lvlJc w:val="left"/>
+      <w:pPr>
+        <w:ind w:left="3600" w:hanging="360"/>
+      </w:pPr>
+    </w:lvl>
+    <w:lvl w:ilvl="5" w:tplc="0409001B" w:tentative="1">
+      <w:start w:val="1"/>
+      <w:numFmt w:val="lowerRoman"/>
+      <w:lvlText w:val="%6."/>
+      <w:lvlJc w:val="right"/>
+      <w:pPr>
+        <w:ind w:left="4320" w:hanging="180"/>
+      </w:pPr>
+    </w:lvl>
+    <w:lvl w:ilvl="6" w:tplc="0409000F" w:tentative="1">
+      <w:start w:val="1"/>
+      <w:numFmt w:val="decimal"/>
+      <w:lvlText w:val="%7."/>
+      <w:lvlJc w:val="left"/>
+      <w:pPr>
+        <w:ind w:left="5040" w:hanging="360"/>
+      </w:pPr>
+    </w:lvl>
+    <w:lvl w:ilvl="7" w:tplc="04090019" w:tentative="1">
+      <w:start w:val="1"/>
+      <w:numFmt w:val="lowerLetter"/>
+      <w:lvlText w:val="%8."/>
+      <w:lvlJc w:val="left"/>
+      <w:pPr>
+        <w:ind w:left="5760" w:hanging="360"/>
+      </w:pPr>
+    </w:lvl>
+    <w:lvl w:ilvl="8" w:tplc="0409001B" w:tentative="1">
+      <w:start w:val="1"/>
+      <w:numFmt w:val="lowerRoman"/>
+      <w:lvlText w:val="%9."/>
+      <w:lvlJc w:val="right"/>
+      <w:pPr>
+        <w:ind w:left="6480" w:hanging="180"/>
+      </w:pPr>
+    </w:lvl>
+  </w:abstractNum>
+  <w:abstractNum w:abstractNumId="4" w15:restartNumberingAfterBreak="0">
     <w:nsid w:val="77E72E9E"/>
     <w:multiLevelType w:val="hybridMultilevel"/>
     <w:tmpl w:val="249494C6"/>
@@ -5255,12 +4031,18 @@
     </w:lvl>
   </w:abstractNum>
   <w:num w:numId="1" w16cid:durableId="111485792">
+    <w:abstractNumId w:val="2"/>
+  </w:num>
+  <w:num w:numId="2" w16cid:durableId="1721904900">
+    <w:abstractNumId w:val="4"/>
+  </w:num>
+  <w:num w:numId="3" w16cid:durableId="1822694025">
     <w:abstractNumId w:val="1"/>
   </w:num>
-  <w:num w:numId="2" w16cid:durableId="1721904900">
-    <w:abstractNumId w:val="2"/>
+  <w:num w:numId="4" w16cid:durableId="578252648">
+    <w:abstractNumId w:val="3"/>
   </w:num>
-  <w:num w:numId="3" w16cid:durableId="1822694025">
+  <w:num w:numId="5" w16cid:durableId="434331511">
     <w:abstractNumId w:val="0"/>
   </w:num>
 </w:numbering>
@@ -5867,6 +4649,7 @@
   <w:style w:type="character" w:default="1" w:styleId="DefaultParagraphFont">
     <w:name w:val="Default Paragraph Font"/>
     <w:uiPriority w:val="1"/>
+    <w:semiHidden/>
     <w:unhideWhenUsed/>
   </w:style>
   <w:style w:type="table" w:default="1" w:styleId="TableNormal">

</xml_diff>